<commit_message>
docs: add interview-prep appendices K–N (scoping, model choice, adding a model, code-review walkthrough)
- Appendix K — Scoping & Approach: why bounded multi-agent, why not single
  mega-prompt / autonomous loop / 2-agent / no-code / fine-tuning
- Appendix L — Why these LLMs (Claude Sonnet, Gemini Flash) and why not
  GPT-4o / Opus / Haiku / local; why a local embedding model
- Appendix M — Adding a new model/provider: the exact files to change
- Appendix N — Code-review walkthrough: every module explained + likely
  interview questions
- Regenerated docs/TECHNICAL_DOCUMENT.docx (with TOC)

Co-Authored-By: Claude Opus 4.8 (1M context) <noreply@anthropic.com>
</commit_message>
<xml_diff>
--- a/docs/TECHNICAL_DOCUMENT.docx
+++ b/docs/TECHNICAL_DOCUMENT.docx
@@ -28,7 +28,7 @@
         </w:p>
       </w:sdtContent>
     </w:sdt>
-    <w:bookmarkStart w:id="173" w:name="X25610cb6729dae425b4d608f896666f92c57500"/>
+    <w:bookmarkStart w:id="188" w:name="X25610cb6729dae425b4d608f896666f92c57500"/>
     <w:p>
       <w:pPr>
         <w:pStyle w:val="Heading1"/>
@@ -761,6 +761,106 @@
       </w:r>
       <w:r>
         <w:t xml:space="preserve">— one line per file</w:t>
+      </w:r>
+    </w:p>
+    <w:p>
+      <w:pPr>
+        <w:pStyle w:val="Compact"/>
+        <w:numPr>
+          <w:ilvl w:val="0"/>
+          <w:numId w:val="1002"/>
+        </w:numPr>
+      </w:pPr>
+      <w:hyperlink w:anchor="X2557f0044018e418819e7c1a512fde83c195e0f">
+        <w:r>
+          <w:rPr>
+            <w:rStyle w:val="Hyperlink"/>
+            <w:b/>
+            <w:bCs/>
+          </w:rPr>
+          <w:t xml:space="preserve">Appendix K — Scoping &amp; Approach</w:t>
+        </w:r>
+      </w:hyperlink>
+      <w:r>
+        <w:t xml:space="preserve"> </w:t>
+      </w:r>
+      <w:r>
+        <w:t xml:space="preserve">— why this approach, why not the alternatives</w:t>
+      </w:r>
+    </w:p>
+    <w:p>
+      <w:pPr>
+        <w:pStyle w:val="Compact"/>
+        <w:numPr>
+          <w:ilvl w:val="0"/>
+          <w:numId w:val="1002"/>
+        </w:numPr>
+      </w:pPr>
+      <w:hyperlink w:anchor="Xc41775734f9b8bdce00b3a187145daba00aeea9">
+        <w:r>
+          <w:rPr>
+            <w:rStyle w:val="Hyperlink"/>
+            <w:b/>
+            <w:bCs/>
+          </w:rPr>
+          <w:t xml:space="preserve">Appendix L — Why these LLMs</w:t>
+        </w:r>
+      </w:hyperlink>
+      <w:r>
+        <w:t xml:space="preserve"> </w:t>
+      </w:r>
+      <w:r>
+        <w:t xml:space="preserve">— model choices and the rejected options</w:t>
+      </w:r>
+    </w:p>
+    <w:p>
+      <w:pPr>
+        <w:pStyle w:val="Compact"/>
+        <w:numPr>
+          <w:ilvl w:val="0"/>
+          <w:numId w:val="1002"/>
+        </w:numPr>
+      </w:pPr>
+      <w:hyperlink w:anchor="Xda4332833dfe9bcd6c5935dbdf6cd25ce99f8d4">
+        <w:r>
+          <w:rPr>
+            <w:rStyle w:val="Hyperlink"/>
+            <w:b/>
+            <w:bCs/>
+          </w:rPr>
+          <w:t xml:space="preserve">Appendix M — Adding a new model / provider</w:t>
+        </w:r>
+      </w:hyperlink>
+      <w:r>
+        <w:t xml:space="preserve"> </w:t>
+      </w:r>
+      <w:r>
+        <w:t xml:space="preserve">— the exact files to change</w:t>
+      </w:r>
+    </w:p>
+    <w:p>
+      <w:pPr>
+        <w:pStyle w:val="Compact"/>
+        <w:numPr>
+          <w:ilvl w:val="0"/>
+          <w:numId w:val="1002"/>
+        </w:numPr>
+      </w:pPr>
+      <w:hyperlink w:anchor="X6249d940ff1af27fe4c51b932ff8e6f67296e10">
+        <w:r>
+          <w:rPr>
+            <w:rStyle w:val="Hyperlink"/>
+            <w:b/>
+            <w:bCs/>
+          </w:rPr>
+          <w:t xml:space="preserve">Appendix N — Code-review walkthrough</w:t>
+        </w:r>
+      </w:hyperlink>
+      <w:r>
+        <w:t xml:space="preserve"> </w:t>
+      </w:r>
+      <w:r>
+        <w:t xml:space="preserve">— every module explained, for interview prep</w:t>
       </w:r>
     </w:p>
     <w:p>
@@ -36534,6 +36634,18 @@
         <w:rPr>
           <w:rStyle w:val="VerbatimChar"/>
         </w:rPr>
+        <w:t xml:space="preserve">single_prompt_baseline.py</w:t>
+      </w:r>
+      <w:r>
+        <w:t xml:space="preserve">,</w:t>
+      </w:r>
+      <w:r>
+        <w:t xml:space="preserve"> </w:t>
+      </w:r>
+      <w:r>
+        <w:rPr>
+          <w:rStyle w:val="VerbatimChar"/>
+        </w:rPr>
         <w:t xml:space="preserve">golden_dataset/</w:t>
       </w:r>
       <w:r>
@@ -36596,13 +36708,16 @@
         <w:t xml:space="preserve"> </w:t>
       </w:r>
       <w:r>
-        <w:t xml:space="preserve">— the single-mega-prompt</w:t>
-      </w:r>
-      <w:r>
-        <w:t xml:space="preserve"> </w:t>
-      </w:r>
-      <w:r>
-        <w:t xml:space="preserve">“before”</w:t>
+        <w:t xml:space="preserve">— an earlier multi-agent snapshot; the genuine single-prompt comparison is</w:t>
+      </w:r>
+      <w:r>
+        <w:t xml:space="preserve"> </w:t>
+      </w:r>
+      <w:r>
+        <w:rPr>
+          <w:rStyle w:val="VerbatimChar"/>
+        </w:rPr>
+        <w:t xml:space="preserve">evaluation/single_prompt_baseline.py</w:t>
       </w:r>
       <w:r>
         <w:t xml:space="preserve"> </w:t>
@@ -36611,8 +36726,3025 @@
         <w:t xml:space="preserve">(Appendix D)</w:t>
       </w:r>
     </w:p>
+    <w:p>
+      <w:r>
+        <w:pict>
+          <v:rect style="width:0;height:1.5pt" o:hralign="center" o:hrstd="t" o:hr="t"/>
+        </w:pict>
+      </w:r>
+    </w:p>
     <w:bookmarkEnd w:id="172"/>
+    <w:bookmarkStart w:id="175" w:name="X791d83de4fc6fc824cc3e59cb9b1380fa6bb122"/>
+    <w:p>
+      <w:pPr>
+        <w:pStyle w:val="Heading2"/>
+      </w:pPr>
+      <w:r>
+        <w:t xml:space="preserve">Appendix K — Scoping &amp; Approach (why this, why not the others)</w:t>
+      </w:r>
+    </w:p>
+    <w:bookmarkStart w:id="173" w:name="how-we-scoped-the-problem"/>
+    <w:p>
+      <w:pPr>
+        <w:pStyle w:val="Heading3"/>
+      </w:pPr>
+      <w:r>
+        <w:t xml:space="preserve">How we scoped the problem</w:t>
+      </w:r>
+    </w:p>
+    <w:p>
+      <w:pPr>
+        <w:pStyle w:val="FirstParagraph"/>
+      </w:pPr>
+      <w:r>
+        <w:t xml:space="preserve">The brief: turn unstructured engineering inputs (meeting transcripts, an architecture wiki, an existing backlog) into a</w:t>
+      </w:r>
+      <w:r>
+        <w:t xml:space="preserve"> </w:t>
+      </w:r>
+      <w:r>
+        <w:rPr>
+          <w:b/>
+          <w:bCs/>
+        </w:rPr>
+        <w:t xml:space="preserve">structured, audited</w:t>
+      </w:r>
+      <w:r>
+        <w:t xml:space="preserve"> </w:t>
+      </w:r>
+      <w:r>
+        <w:t xml:space="preserve">set of backlog items, with duplicate / conflict / gap detection. We scoped it as:</w:t>
+      </w:r>
+    </w:p>
+    <w:p>
+      <w:pPr>
+        <w:pStyle w:val="BodyText"/>
+      </w:pPr>
+      <w:r>
+        <w:rPr>
+          <w:b/>
+          <w:bCs/>
+        </w:rPr>
+        <w:t xml:space="preserve">In scope (and built):</w:t>
+      </w:r>
+      <w:r>
+        <w:t xml:space="preserve"> </w:t>
+      </w:r>
+      <w:r>
+        <w:t xml:space="preserve">ingest txt/md/pdf transcripts + a wiki + JIRA/GitHub tickets; produce epics → stories (Given/When/Then AC, priority + rationale, tags) → tasks; detect duplicates (vs. the backlog), conflicts (vs. architectural constraints), and gaps; a full audit trail; CLI</w:t>
+      </w:r>
+      <w:r>
+        <w:t xml:space="preserve"> </w:t>
+      </w:r>
+      <w:r>
+        <w:rPr>
+          <w:b/>
+          <w:bCs/>
+        </w:rPr>
+        <w:t xml:space="preserve">and</w:t>
+      </w:r>
+      <w:r>
+        <w:t xml:space="preserve"> </w:t>
+      </w:r>
+      <w:r>
+        <w:t xml:space="preserve">Streamlit UI; mock</w:t>
+      </w:r>
+      <w:r>
+        <w:t xml:space="preserve"> </w:t>
+      </w:r>
+      <w:r>
+        <w:rPr>
+          <w:b/>
+          <w:bCs/>
+        </w:rPr>
+        <w:t xml:space="preserve">and</w:t>
+      </w:r>
+      <w:r>
+        <w:t xml:space="preserve"> </w:t>
+      </w:r>
+      <w:r>
+        <w:t xml:space="preserve">live Atlassian; Jira write-back; an evaluation harness.</w:t>
+      </w:r>
+    </w:p>
+    <w:p>
+      <w:pPr>
+        <w:pStyle w:val="BodyText"/>
+      </w:pPr>
+      <w:r>
+        <w:rPr>
+          <w:b/>
+          <w:bCs/>
+        </w:rPr>
+        <w:t xml:space="preserve">Deliberately out of scope:</w:t>
+      </w:r>
+      <w:r>
+        <w:t xml:space="preserve"> </w:t>
+      </w:r>
+      <w:r>
+        <w:t xml:space="preserve">two-way Jira sync, auth / multi-tenant isolation, autonomous re-planning loops, OCR for scanned PDFs, and model fine-tuning. Each is noted in</w:t>
+      </w:r>
+      <w:r>
+        <w:t xml:space="preserve"> </w:t>
+      </w:r>
+      <w:r>
+        <w:rPr>
+          <w:rStyle w:val="VerbatimChar"/>
+        </w:rPr>
+        <w:t xml:space="preserve">PRODUCTION_READINESS.md</w:t>
+      </w:r>
+      <w:r>
+        <w:t xml:space="preserve"> </w:t>
+      </w:r>
+      <w:r>
+        <w:t xml:space="preserve">rather than hidden.</w:t>
+      </w:r>
+    </w:p>
+    <w:p>
+      <w:pPr>
+        <w:pStyle w:val="BodyText"/>
+      </w:pPr>
+      <w:r>
+        <w:rPr>
+          <w:b/>
+          <w:bCs/>
+        </w:rPr>
+        <w:t xml:space="preserve">Hard constraints we held to:</w:t>
+      </w:r>
+      <w:r>
+        <w:t xml:space="preserve"> </w:t>
+      </w:r>
+      <w:r>
+        <w:t xml:space="preserve">reproducibility, testability with zero API spend, cost-bounded execution (a fixed number of LLM calls), and auditability (the brief explicitly requires</w:t>
+      </w:r>
+      <w:r>
+        <w:t xml:space="preserve"> </w:t>
+      </w:r>
+      <w:r>
+        <w:t xml:space="preserve">“audit logs must show how conclusions were reached”</w:t>
+      </w:r>
+      <w:r>
+        <w:t xml:space="preserve">).</w:t>
+      </w:r>
+    </w:p>
     <w:bookmarkEnd w:id="173"/>
+    <w:bookmarkStart w:id="174" w:name="X833f103deb81cd5f9f032331b0d7f6ecf9e1faf"/>
+    <w:p>
+      <w:pPr>
+        <w:pStyle w:val="Heading3"/>
+      </w:pPr>
+      <w:r>
+        <w:t xml:space="preserve">Why bounded multi-agent — and why not the alternatives</w:t>
+      </w:r>
+    </w:p>
+    <w:tbl>
+      <w:tblPr>
+        <w:tblStyle w:val="Table"/>
+        <w:tblW w:type="pct" w:w="5000"/>
+        <w:tblLayout w:type="fixed"/>
+        <w:tblLook w:firstRow="1" w:lastRow="0" w:firstColumn="0" w:lastColumn="0" w:noHBand="0" w:noVBand="0" w:val="0020"/>
+      </w:tblPr>
+      <w:tblGrid>
+        <w:gridCol w:w="3960"/>
+        <w:gridCol w:w="3960"/>
+      </w:tblGrid>
+      <w:tr>
+        <w:trPr>
+          <w:tblHeader w:val="on"/>
+        </w:trPr>
+        <w:tc>
+          <w:tcPr/>
+          <w:p>
+            <w:pPr>
+              <w:pStyle w:val="Compact"/>
+            </w:pPr>
+            <w:r>
+              <w:t xml:space="preserve">Approach considered</w:t>
+            </w:r>
+          </w:p>
+        </w:tc>
+        <w:tc>
+          <w:tcPr/>
+          <w:p>
+            <w:pPr>
+              <w:pStyle w:val="Compact"/>
+            </w:pPr>
+            <w:r>
+              <w:t xml:space="preserve">Why rejected (or chosen)</w:t>
+            </w:r>
+          </w:p>
+        </w:tc>
+      </w:tr>
+      <w:tr>
+        <w:tc>
+          <w:tcPr/>
+          <w:p>
+            <w:pPr>
+              <w:pStyle w:val="Compact"/>
+            </w:pPr>
+            <w:r>
+              <w:rPr>
+                <w:b/>
+                <w:bCs/>
+              </w:rPr>
+              <w:t xml:space="preserve">Single mega-prompt</w:t>
+            </w:r>
+          </w:p>
+        </w:tc>
+        <w:tc>
+          <w:tcPr/>
+          <w:p>
+            <w:pPr>
+              <w:pStyle w:val="Compact"/>
+            </w:pPr>
+            <w:r>
+              <w:t xml:space="preserve">We</w:t>
+            </w:r>
+            <w:r>
+              <w:t xml:space="preserve"> </w:t>
+            </w:r>
+            <w:r>
+              <w:rPr>
+                <w:i/>
+                <w:iCs/>
+              </w:rPr>
+              <w:t xml:space="preserve">built and measured</w:t>
+            </w:r>
+            <w:r>
+              <w:t xml:space="preserve"> </w:t>
+            </w:r>
+            <w:r>
+              <w:t xml:space="preserve">it (Appendix D): comparable quality on small inputs, but no intermediate artifacts to audit, no partial-failure recovery, and duplicate-detection collapses once the backlog won’t fit a context window.</w:t>
+            </w:r>
+          </w:p>
+        </w:tc>
+      </w:tr>
+      <w:tr>
+        <w:tc>
+          <w:tcPr/>
+          <w:p>
+            <w:pPr>
+              <w:pStyle w:val="Compact"/>
+            </w:pPr>
+            <w:r>
+              <w:rPr>
+                <w:b/>
+                <w:bCs/>
+              </w:rPr>
+              <w:t xml:space="preserve">Autonomous agent loop</w:t>
+            </w:r>
+            <w:r>
+              <w:t xml:space="preserve"> </w:t>
+            </w:r>
+            <w:r>
+              <w:t xml:space="preserve">(ReAct /</w:t>
+            </w:r>
+            <w:r>
+              <w:t xml:space="preserve"> </w:t>
+            </w:r>
+            <w:r>
+              <w:t xml:space="preserve">“let the model decide what to call next”</w:t>
+            </w:r>
+            <w:r>
+              <w:t xml:space="preserve">)</w:t>
+            </w:r>
+          </w:p>
+        </w:tc>
+        <w:tc>
+          <w:tcPr/>
+          <w:p>
+            <w:pPr>
+              <w:pStyle w:val="Compact"/>
+            </w:pPr>
+            <w:r>
+              <w:t xml:space="preserve">Unbounded cost and call count, hard to budget, hard to test, and the audit trail becomes a graph instead of a linear trace. We wanted bounded + reproducible.</w:t>
+            </w:r>
+          </w:p>
+        </w:tc>
+      </w:tr>
+      <w:tr>
+        <w:tc>
+          <w:tcPr/>
+          <w:p>
+            <w:pPr>
+              <w:pStyle w:val="Compact"/>
+            </w:pPr>
+            <w:r>
+              <w:rPr>
+                <w:b/>
+                <w:bCs/>
+              </w:rPr>
+              <w:t xml:space="preserve">Two agents (Extract + Synthesize)</w:t>
+            </w:r>
+          </w:p>
+        </w:tc>
+        <w:tc>
+          <w:tcPr/>
+          <w:p>
+            <w:pPr>
+              <w:pStyle w:val="Compact"/>
+            </w:pPr>
+            <w:r>
+              <w:t xml:space="preserve">The synthesizer ends up juggling constraints + backlog matching + prioritization + decomposition in one prompt — the same focus problem as one mega-prompt.</w:t>
+            </w:r>
+          </w:p>
+        </w:tc>
+      </w:tr>
+      <w:tr>
+        <w:tc>
+          <w:tcPr/>
+          <w:p>
+            <w:pPr>
+              <w:pStyle w:val="Compact"/>
+            </w:pPr>
+            <w:r>
+              <w:rPr>
+                <w:b/>
+                <w:bCs/>
+              </w:rPr>
+              <w:t xml:space="preserve">No-code / SaaS</w:t>
+            </w:r>
+            <w:r>
+              <w:t xml:space="preserve"> </w:t>
+            </w:r>
+            <w:r>
+              <w:t xml:space="preserve">(Zapier, n8n + one LLM call)</w:t>
+            </w:r>
+          </w:p>
+        </w:tc>
+        <w:tc>
+          <w:tcPr/>
+          <w:p>
+            <w:pPr>
+              <w:pStyle w:val="Compact"/>
+            </w:pPr>
+            <w:r>
+              <w:t xml:space="preserve">Can’t do the constraint-vs-story conflict reasoning or produce a defensible audit chain; and it wouldn’t demonstrate engineering.</w:t>
+            </w:r>
+          </w:p>
+        </w:tc>
+      </w:tr>
+      <w:tr>
+        <w:tc>
+          <w:tcPr/>
+          <w:p>
+            <w:pPr>
+              <w:pStyle w:val="Compact"/>
+            </w:pPr>
+            <w:r>
+              <w:rPr>
+                <w:b/>
+                <w:bCs/>
+              </w:rPr>
+              <w:t xml:space="preserve">Fine-tuning a custom model</w:t>
+            </w:r>
+          </w:p>
+        </w:tc>
+        <w:tc>
+          <w:tcPr/>
+          <w:p>
+            <w:pPr>
+              <w:pStyle w:val="Compact"/>
+            </w:pPr>
+            <w:r>
+              <w:t xml:space="preserve">Data-hungry, slow to iterate, and opaque. Prompt engineering + RAG reached the goal faster and stays explainable.</w:t>
+            </w:r>
+          </w:p>
+        </w:tc>
+      </w:tr>
+      <w:tr>
+        <w:tc>
+          <w:tcPr/>
+          <w:p>
+            <w:pPr>
+              <w:pStyle w:val="Compact"/>
+            </w:pPr>
+            <w:r>
+              <w:rPr>
+                <w:b/>
+                <w:bCs/>
+              </w:rPr>
+              <w:t xml:space="preserve">Bounded multi-agent (chosen)</w:t>
+            </w:r>
+          </w:p>
+        </w:tc>
+        <w:tc>
+          <w:tcPr/>
+          <w:p>
+            <w:pPr>
+              <w:pStyle w:val="Compact"/>
+            </w:pPr>
+            <w:r>
+              <w:t xml:space="preserve">One reasoning task per agent, shared audited memory, deterministic ordering → reproducible, testable, cost-bounded, auditable.</w:t>
+            </w:r>
+          </w:p>
+        </w:tc>
+      </w:tr>
+    </w:tbl>
+    <w:p>
+      <w:pPr>
+        <w:pStyle w:val="BodyText"/>
+      </w:pPr>
+      <w:r>
+        <w:rPr>
+          <w:b/>
+          <w:bCs/>
+        </w:rPr>
+        <w:t xml:space="preserve">Honest self-assessment of the scoping:</w:t>
+      </w:r>
+      <w:r>
+        <w:t xml:space="preserve"> </w:t>
+      </w:r>
+      <w:r>
+        <w:t xml:space="preserve">we matched scope to a demo timeline — broad enough to show agentic orchestration + RAG + audit + live integrations + write-back, bounded enough to stay testable and honest. The committed single-prompt baseline (Appendix D) is the evidence that we</w:t>
+      </w:r>
+      <w:r>
+        <w:t xml:space="preserve"> </w:t>
+      </w:r>
+      <w:r>
+        <w:rPr>
+          <w:i/>
+          <w:iCs/>
+        </w:rPr>
+        <w:t xml:space="preserve">measured</w:t>
+      </w:r>
+      <w:r>
+        <w:t xml:space="preserve"> </w:t>
+      </w:r>
+      <w:r>
+        <w:t xml:space="preserve">the core architecture decision rather than just asserting it.</w:t>
+      </w:r>
+    </w:p>
+    <w:p>
+      <w:r>
+        <w:pict>
+          <v:rect style="width:0;height:1.5pt" o:hralign="center" o:hrstd="t" o:hr="t"/>
+        </w:pict>
+      </w:r>
+    </w:p>
+    <w:bookmarkEnd w:id="174"/>
+    <w:bookmarkEnd w:id="175"/>
+    <w:bookmarkStart w:id="176" w:name="appendix-l-why-these-llms-and-not-others"/>
+    <w:p>
+      <w:pPr>
+        <w:pStyle w:val="Heading2"/>
+      </w:pPr>
+      <w:r>
+        <w:t xml:space="preserve">Appendix L — Why these LLMs (and not others)</w:t>
+      </w:r>
+    </w:p>
+    <w:p>
+      <w:pPr>
+        <w:pStyle w:val="FirstParagraph"/>
+      </w:pPr>
+      <w:r>
+        <w:t xml:space="preserve">The provider is chosen</w:t>
+      </w:r>
+      <w:r>
+        <w:t xml:space="preserve"> </w:t>
+      </w:r>
+      <w:r>
+        <w:rPr>
+          <w:b/>
+          <w:bCs/>
+        </w:rPr>
+        <w:t xml:space="preserve">per stage</w:t>
+      </w:r>
+      <w:r>
+        <w:t xml:space="preserve"> </w:t>
+      </w:r>
+      <w:r>
+        <w:t xml:space="preserve">(Free / Balanced / Premium presets + per-stage override), so this is a cost-vs-quality dial, not a single bet.</w:t>
+      </w:r>
+    </w:p>
+    <w:p>
+      <w:pPr>
+        <w:pStyle w:val="BodyText"/>
+      </w:pPr>
+      <w:r>
+        <w:rPr>
+          <w:b/>
+          <w:bCs/>
+        </w:rPr>
+        <w:t xml:space="preserve">Claude Sonnet 4.5</w:t>
+      </w:r>
+      <w:r>
+        <w:t xml:space="preserve"> </w:t>
+      </w:r>
+      <w:r>
+        <w:t xml:space="preserve">— primary for the hardest reasoning (the Story Writer) and all of Premium. Why: the most reliable instruction-following + JSON-only output in our testing, strong long-context handling, and it’s vision-capable (whiteboard photos). The nuanced</w:t>
+      </w:r>
+      <w:r>
+        <w:t xml:space="preserve"> </w:t>
+      </w:r>
+      <w:r>
+        <w:t xml:space="preserve">“same topic vs. same work”</w:t>
+      </w:r>
+      <w:r>
+        <w:t xml:space="preserve"> </w:t>
+      </w:r>
+      <w:r>
+        <w:t xml:space="preserve">dedup and the priority rubric behaved most consistently here.</w:t>
+      </w:r>
+    </w:p>
+    <w:p>
+      <w:pPr>
+        <w:pStyle w:val="BodyText"/>
+      </w:pPr>
+      <w:r>
+        <w:rPr>
+          <w:b/>
+          <w:bCs/>
+        </w:rPr>
+        <w:t xml:space="preserve">Gemini 2.5 Flash</w:t>
+      </w:r>
+      <w:r>
+        <w:t xml:space="preserve"> </w:t>
+      </w:r>
+      <w:r>
+        <w:t xml:space="preserve">— the Free preset and the four mechanical stages in Balanced. Why: fast and cheap for the more mechanical extraction/decomposition work, with a generous free tier so a reviewer without a Claude key can still run it.</w:t>
+      </w:r>
+    </w:p>
+    <w:p>
+      <w:pPr>
+        <w:pStyle w:val="BodyText"/>
+      </w:pPr>
+      <w:r>
+        <w:rPr>
+          <w:b/>
+          <w:bCs/>
+        </w:rPr>
+        <w:t xml:space="preserve">Why not the others:</w:t>
+      </w:r>
+      <w:r>
+        <w:t xml:space="preserve"> </w:t>
+      </w:r>
+      <w:r>
+        <w:t xml:space="preserve">-</w:t>
+      </w:r>
+      <w:r>
+        <w:t xml:space="preserve"> </w:t>
+      </w:r>
+      <w:r>
+        <w:rPr>
+          <w:b/>
+          <w:bCs/>
+        </w:rPr>
+        <w:t xml:space="preserve">GPT-4o / OpenAI</w:t>
+      </w:r>
+      <w:r>
+        <w:t xml:space="preserve"> </w:t>
+      </w:r>
+      <w:r>
+        <w:t xml:space="preserve">— would work; we standardized on Anthropic for the strongest structured-JSON instruction-following in our testing and to avoid a third SDK + key. The architecture is provider-agnostic, so it’s a small add (Appendix M).</w:t>
+      </w:r>
+      <w:r>
+        <w:t xml:space="preserve"> </w:t>
+      </w:r>
+      <w:r>
+        <w:t xml:space="preserve">-</w:t>
+      </w:r>
+      <w:r>
+        <w:t xml:space="preserve"> </w:t>
+      </w:r>
+      <w:r>
+        <w:rPr>
+          <w:b/>
+          <w:bCs/>
+        </w:rPr>
+        <w:t xml:space="preserve">Claude Opus</w:t>
+      </w:r>
+      <w:r>
+        <w:t xml:space="preserve"> </w:t>
+      </w:r>
+      <w:r>
+        <w:t xml:space="preserve">— best reasoning, but ~5× Sonnet’s cost; this is structured extraction, not deep open-ended reasoning, so Opus is overkill.</w:t>
+      </w:r>
+      <w:r>
+        <w:t xml:space="preserve"> </w:t>
+      </w:r>
+      <w:r>
+        <w:t xml:space="preserve">-</w:t>
+      </w:r>
+      <w:r>
+        <w:t xml:space="preserve"> </w:t>
+      </w:r>
+      <w:r>
+        <w:rPr>
+          <w:b/>
+          <w:bCs/>
+        </w:rPr>
+        <w:t xml:space="preserve">Claude Haiku</w:t>
+      </w:r>
+      <w:r>
+        <w:t xml:space="preserve"> </w:t>
+      </w:r>
+      <w:r>
+        <w:t xml:space="preserve">— cheap and fast, but the quality drop on the priority rubric and dedup-vs-same-topic wasn’t worth it on the</w:t>
+      </w:r>
+      <w:r>
+        <w:t xml:space="preserve"> </w:t>
+      </w:r>
+      <w:r>
+        <w:rPr>
+          <w:i/>
+          <w:iCs/>
+        </w:rPr>
+        <w:t xml:space="preserve">reasoning</w:t>
+      </w:r>
+      <w:r>
+        <w:t xml:space="preserve"> </w:t>
+      </w:r>
+      <w:r>
+        <w:t xml:space="preserve">stages. It’s a perfectly good per-stage choice for the Parser/Constraint Extractor if cost matters — and the per-stage picker makes that a one-click change.</w:t>
+      </w:r>
+      <w:r>
+        <w:t xml:space="preserve"> </w:t>
+      </w:r>
+      <w:r>
+        <w:t xml:space="preserve">-</w:t>
+      </w:r>
+      <w:r>
+        <w:t xml:space="preserve"> </w:t>
+      </w:r>
+      <w:r>
+        <w:rPr>
+          <w:b/>
+          <w:bCs/>
+        </w:rPr>
+        <w:t xml:space="preserve">Local / open models (Llama, etc.)</w:t>
+      </w:r>
+      <w:r>
+        <w:t xml:space="preserve"> </w:t>
+      </w:r>
+      <w:r>
+        <w:t xml:space="preserve">— no key, private, but weaker JSON reliability and real ops burden. We</w:t>
+      </w:r>
+      <w:r>
+        <w:t xml:space="preserve"> </w:t>
+      </w:r>
+      <w:r>
+        <w:rPr>
+          <w:i/>
+          <w:iCs/>
+        </w:rPr>
+        <w:t xml:space="preserve">did</w:t>
+      </w:r>
+      <w:r>
+        <w:t xml:space="preserve"> </w:t>
+      </w:r>
+      <w:r>
+        <w:t xml:space="preserve">go local exactly where local is the right call: the</w:t>
+      </w:r>
+      <w:r>
+        <w:t xml:space="preserve"> </w:t>
+      </w:r>
+      <w:r>
+        <w:rPr>
+          <w:b/>
+          <w:bCs/>
+        </w:rPr>
+        <w:t xml:space="preserve">embedding model</w:t>
+      </w:r>
+      <w:r>
+        <w:t xml:space="preserve"> </w:t>
+      </w:r>
+      <w:r>
+        <w:t xml:space="preserve">(</w:t>
+      </w:r>
+      <w:r>
+        <w:rPr>
+          <w:rStyle w:val="VerbatimChar"/>
+        </w:rPr>
+        <w:t xml:space="preserve">all-MiniLM-L6-v2</w:t>
+      </w:r>
+      <w:r>
+        <w:t xml:space="preserve">) for duplicate detection — free at runtime, offline, ~80 MB, and plenty accurate for</w:t>
+      </w:r>
+      <w:r>
+        <w:t xml:space="preserve"> </w:t>
+      </w:r>
+      <w:r>
+        <w:t xml:space="preserve">“find similar tickets.”</w:t>
+      </w:r>
+    </w:p>
+    <w:p>
+      <w:r>
+        <w:pict>
+          <v:rect style="width:0;height:1.5pt" o:hralign="center" o:hrstd="t" o:hr="t"/>
+        </w:pict>
+      </w:r>
+    </w:p>
+    <w:bookmarkEnd w:id="176"/>
+    <w:bookmarkStart w:id="177" w:name="X18a9a6ee0f7ccef36421487e685bea15d61dbe0"/>
+    <w:p>
+      <w:pPr>
+        <w:pStyle w:val="Heading2"/>
+      </w:pPr>
+      <w:r>
+        <w:t xml:space="preserve">Appendix M — Adding a new model / provider (exact changes)</w:t>
+      </w:r>
+    </w:p>
+    <w:p>
+      <w:pPr>
+        <w:pStyle w:val="FirstParagraph"/>
+      </w:pPr>
+      <w:r>
+        <w:t xml:space="preserve">The tool abstraction means a new provider is a contained change. To add, e.g., OpenAI GPT-4o:</w:t>
+      </w:r>
+    </w:p>
+    <w:p>
+      <w:pPr>
+        <w:pStyle w:val="Compact"/>
+        <w:numPr>
+          <w:ilvl w:val="0"/>
+          <w:numId w:val="1026"/>
+        </w:numPr>
+      </w:pPr>
+      <w:r>
+        <w:rPr>
+          <w:b/>
+          <w:bCs/>
+        </w:rPr>
+        <w:t xml:space="preserve">New tool</w:t>
+      </w:r>
+      <w:r>
+        <w:t xml:space="preserve"> </w:t>
+      </w:r>
+      <w:r>
+        <w:t xml:space="preserve">—</w:t>
+      </w:r>
+      <w:r>
+        <w:t xml:space="preserve"> </w:t>
+      </w:r>
+      <w:r>
+        <w:rPr>
+          <w:rStyle w:val="VerbatimChar"/>
+        </w:rPr>
+        <w:t xml:space="preserve">src/tools/openai_tool.py</w:t>
+      </w:r>
+      <w:r>
+        <w:t xml:space="preserve">, mirroring</w:t>
+      </w:r>
+      <w:r>
+        <w:t xml:space="preserve"> </w:t>
+      </w:r>
+      <w:r>
+        <w:rPr>
+          <w:rStyle w:val="VerbatimChar"/>
+        </w:rPr>
+        <w:t xml:space="preserve">ClaudeTool</w:t>
+      </w:r>
+      <w:r>
+        <w:t xml:space="preserve">: implement</w:t>
+      </w:r>
+      <w:r>
+        <w:t xml:space="preserve"> </w:t>
+      </w:r>
+      <w:r>
+        <w:rPr>
+          <w:rStyle w:val="VerbatimChar"/>
+        </w:rPr>
+        <w:t xml:space="preserve">call_for_json(user_message, max_tokens, images=…) -&gt; (dict, usage)</w:t>
+      </w:r>
+      <w:r>
+        <w:t xml:space="preserve">, reuse the same JSON-extraction +</w:t>
+      </w:r>
+      <w:r>
+        <w:t xml:space="preserve"> </w:t>
+      </w:r>
+      <w:r>
+        <w:rPr>
+          <w:rStyle w:val="VerbatimChar"/>
+        </w:rPr>
+        <w:t xml:space="preserve">tenacity</w:t>
+      </w:r>
+      <w:r>
+        <w:t xml:space="preserve"> </w:t>
+      </w:r>
+      <w:r>
+        <w:t xml:space="preserve">retry pattern, lazy-import the SDK, and raise</w:t>
+      </w:r>
+      <w:r>
+        <w:t xml:space="preserve"> </w:t>
+      </w:r>
+      <w:r>
+        <w:rPr>
+          <w:rStyle w:val="VerbatimChar"/>
+        </w:rPr>
+        <w:t xml:space="preserve">ToolError</w:t>
+      </w:r>
+      <w:r>
+        <w:t xml:space="preserve"> </w:t>
+      </w:r>
+      <w:r>
+        <w:t xml:space="preserve">on a missing key / API error.</w:t>
+      </w:r>
+    </w:p>
+    <w:p>
+      <w:pPr>
+        <w:pStyle w:val="Compact"/>
+        <w:numPr>
+          <w:ilvl w:val="0"/>
+          <w:numId w:val="1026"/>
+        </w:numPr>
+      </w:pPr>
+      <w:r>
+        <w:rPr>
+          <w:b/>
+          <w:bCs/>
+        </w:rPr>
+        <w:t xml:space="preserve">Dispatch</w:t>
+      </w:r>
+      <w:r>
+        <w:t xml:space="preserve"> </w:t>
+      </w:r>
+      <w:r>
+        <w:t xml:space="preserve">—</w:t>
+      </w:r>
+      <w:r>
+        <w:t xml:space="preserve"> </w:t>
+      </w:r>
+      <w:r>
+        <w:rPr>
+          <w:rStyle w:val="VerbatimChar"/>
+        </w:rPr>
+        <w:t xml:space="preserve">src/orchestrator.py::_build_tool_for_model</w:t>
+      </w:r>
+      <w:r>
+        <w:t xml:space="preserve">: add</w:t>
+      </w:r>
+      <w:r>
+        <w:t xml:space="preserve"> </w:t>
+      </w:r>
+      <w:r>
+        <w:rPr>
+          <w:rStyle w:val="VerbatimChar"/>
+        </w:rPr>
+        <w:t xml:space="preserve">elif mid.startswith("gpt"): return OpenAITool(model=model_id)</w:t>
+      </w:r>
+      <w:r>
+        <w:t xml:space="preserve">.</w:t>
+      </w:r>
+    </w:p>
+    <w:p>
+      <w:pPr>
+        <w:pStyle w:val="Compact"/>
+        <w:numPr>
+          <w:ilvl w:val="0"/>
+          <w:numId w:val="1026"/>
+        </w:numPr>
+      </w:pPr>
+      <w:r>
+        <w:rPr>
+          <w:b/>
+          <w:bCs/>
+        </w:rPr>
+        <w:t xml:space="preserve">Failover partner</w:t>
+      </w:r>
+      <w:r>
+        <w:t xml:space="preserve"> </w:t>
+      </w:r>
+      <w:r>
+        <w:t xml:space="preserve">—</w:t>
+      </w:r>
+      <w:r>
+        <w:t xml:space="preserve"> </w:t>
+      </w:r>
+      <w:r>
+        <w:rPr>
+          <w:rStyle w:val="VerbatimChar"/>
+        </w:rPr>
+        <w:t xml:space="preserve">src/orchestrator.py::_fallback_model</w:t>
+      </w:r>
+      <w:r>
+        <w:t xml:space="preserve">: decide what it fails over to (e.g. </w:t>
+      </w:r>
+      <w:r>
+        <w:rPr>
+          <w:rStyle w:val="VerbatimChar"/>
+        </w:rPr>
+        <w:t xml:space="preserve">gpt-* → claude-sonnet-4-5</w:t>
+      </w:r>
+      <w:r>
+        <w:t xml:space="preserve">).</w:t>
+      </w:r>
+    </w:p>
+    <w:p>
+      <w:pPr>
+        <w:pStyle w:val="Compact"/>
+        <w:numPr>
+          <w:ilvl w:val="0"/>
+          <w:numId w:val="1026"/>
+        </w:numPr>
+      </w:pPr>
+      <w:r>
+        <w:rPr>
+          <w:b/>
+          <w:bCs/>
+        </w:rPr>
+        <w:t xml:space="preserve">Pricing</w:t>
+      </w:r>
+      <w:r>
+        <w:t xml:space="preserve"> </w:t>
+      </w:r>
+      <w:r>
+        <w:t xml:space="preserve">—</w:t>
+      </w:r>
+      <w:r>
+        <w:t xml:space="preserve"> </w:t>
+      </w:r>
+      <w:r>
+        <w:rPr>
+          <w:rStyle w:val="VerbatimChar"/>
+        </w:rPr>
+        <w:t xml:space="preserve">src/pricing.py</w:t>
+      </w:r>
+      <w:r>
+        <w:t xml:space="preserve">: add the model’s input/output $/1M rates so the cost panel stays accurate.</w:t>
+      </w:r>
+    </w:p>
+    <w:p>
+      <w:pPr>
+        <w:pStyle w:val="Compact"/>
+        <w:numPr>
+          <w:ilvl w:val="0"/>
+          <w:numId w:val="1026"/>
+        </w:numPr>
+      </w:pPr>
+      <w:r>
+        <w:rPr>
+          <w:b/>
+          <w:bCs/>
+        </w:rPr>
+        <w:t xml:space="preserve">Presets / picker</w:t>
+      </w:r>
+      <w:r>
+        <w:t xml:space="preserve"> </w:t>
+      </w:r>
+      <w:r>
+        <w:t xml:space="preserve">—</w:t>
+      </w:r>
+      <w:r>
+        <w:t xml:space="preserve"> </w:t>
+      </w:r>
+      <w:r>
+        <w:rPr>
+          <w:rStyle w:val="VerbatimChar"/>
+        </w:rPr>
+        <w:t xml:space="preserve">app.py</w:t>
+      </w:r>
+      <w:r>
+        <w:t xml:space="preserve">: add it to</w:t>
+      </w:r>
+      <w:r>
+        <w:t xml:space="preserve"> </w:t>
+      </w:r>
+      <w:r>
+        <w:rPr>
+          <w:rStyle w:val="VerbatimChar"/>
+        </w:rPr>
+        <w:t xml:space="preserve">MODEL_PRESETS</w:t>
+      </w:r>
+      <w:r>
+        <w:t xml:space="preserve"> </w:t>
+      </w:r>
+      <w:r>
+        <w:t xml:space="preserve">and the per-stage</w:t>
+      </w:r>
+      <w:r>
+        <w:t xml:space="preserve"> </w:t>
+      </w:r>
+      <w:r>
+        <w:rPr>
+          <w:rStyle w:val="VerbatimChar"/>
+        </w:rPr>
+        <w:t xml:space="preserve">MODEL_OPTIONS</w:t>
+      </w:r>
+      <w:r>
+        <w:t xml:space="preserve"> </w:t>
+      </w:r>
+      <w:r>
+        <w:t xml:space="preserve">selectbox; optionally</w:t>
+      </w:r>
+      <w:r>
+        <w:t xml:space="preserve"> </w:t>
+      </w:r>
+      <w:r>
+        <w:rPr>
+          <w:rStyle w:val="VerbatimChar"/>
+        </w:rPr>
+        <w:t xml:space="preserve">DEFAULT_STAGE_MODELS</w:t>
+      </w:r>
+      <w:r>
+        <w:t xml:space="preserve"> </w:t>
+      </w:r>
+      <w:r>
+        <w:t xml:space="preserve">in the orchestrator.</w:t>
+      </w:r>
+    </w:p>
+    <w:p>
+      <w:pPr>
+        <w:pStyle w:val="Compact"/>
+        <w:numPr>
+          <w:ilvl w:val="0"/>
+          <w:numId w:val="1026"/>
+        </w:numPr>
+      </w:pPr>
+      <w:r>
+        <w:rPr>
+          <w:b/>
+          <w:bCs/>
+        </w:rPr>
+        <w:t xml:space="preserve">Vision</w:t>
+      </w:r>
+      <w:r>
+        <w:t xml:space="preserve"> </w:t>
+      </w:r>
+      <w:r>
+        <w:t xml:space="preserve">— if it’s vision-capable, give its</w:t>
+      </w:r>
+      <w:r>
+        <w:t xml:space="preserve"> </w:t>
+      </w:r>
+      <w:r>
+        <w:rPr>
+          <w:rStyle w:val="VerbatimChar"/>
+        </w:rPr>
+        <w:t xml:space="preserve">call_for_json</w:t>
+      </w:r>
+      <w:r>
+        <w:t xml:space="preserve"> </w:t>
+      </w:r>
+      <w:r>
+        <w:t xml:space="preserve">an</w:t>
+      </w:r>
+      <w:r>
+        <w:t xml:space="preserve"> </w:t>
+      </w:r>
+      <w:r>
+        <w:rPr>
+          <w:rStyle w:val="VerbatimChar"/>
+        </w:rPr>
+        <w:t xml:space="preserve">images=</w:t>
+      </w:r>
+      <w:r>
+        <w:t xml:space="preserve"> </w:t>
+      </w:r>
+      <w:r>
+        <w:t xml:space="preserve">parameter (the Parser forwards images only to tools whose signature includes</w:t>
+      </w:r>
+      <w:r>
+        <w:t xml:space="preserve"> </w:t>
+      </w:r>
+      <w:r>
+        <w:rPr>
+          <w:rStyle w:val="VerbatimChar"/>
+        </w:rPr>
+        <w:t xml:space="preserve">images</w:t>
+      </w:r>
+      <w:r>
+        <w:t xml:space="preserve">). If not, the existing vision auto-switch already routes images to Claude.</w:t>
+      </w:r>
+    </w:p>
+    <w:p>
+      <w:pPr>
+        <w:pStyle w:val="Compact"/>
+        <w:numPr>
+          <w:ilvl w:val="0"/>
+          <w:numId w:val="1026"/>
+        </w:numPr>
+      </w:pPr>
+      <w:r>
+        <w:rPr>
+          <w:b/>
+          <w:bCs/>
+        </w:rPr>
+        <w:t xml:space="preserve">Env</w:t>
+      </w:r>
+      <w:r>
+        <w:t xml:space="preserve"> </w:t>
+      </w:r>
+      <w:r>
+        <w:t xml:space="preserve">— read the key in the tool’s</w:t>
+      </w:r>
+      <w:r>
+        <w:t xml:space="preserve"> </w:t>
+      </w:r>
+      <w:r>
+        <w:rPr>
+          <w:rStyle w:val="VerbatimChar"/>
+        </w:rPr>
+        <w:t xml:space="preserve">__init__</w:t>
+      </w:r>
+      <w:r>
+        <w:t xml:space="preserve">; add it to</w:t>
+      </w:r>
+      <w:r>
+        <w:t xml:space="preserve"> </w:t>
+      </w:r>
+      <w:r>
+        <w:rPr>
+          <w:rStyle w:val="VerbatimChar"/>
+        </w:rPr>
+        <w:t xml:space="preserve">.env.example</w:t>
+      </w:r>
+      <w:r>
+        <w:t xml:space="preserve">.</w:t>
+      </w:r>
+    </w:p>
+    <w:p>
+      <w:pPr>
+        <w:pStyle w:val="Compact"/>
+        <w:numPr>
+          <w:ilvl w:val="0"/>
+          <w:numId w:val="1026"/>
+        </w:numPr>
+      </w:pPr>
+      <w:r>
+        <w:rPr>
+          <w:b/>
+          <w:bCs/>
+        </w:rPr>
+        <w:t xml:space="preserve">Tests</w:t>
+      </w:r>
+      <w:r>
+        <w:t xml:space="preserve"> </w:t>
+      </w:r>
+      <w:r>
+        <w:t xml:space="preserve">— add a tool-level test mocking the SDK. The agents and orchestrator are provider-agnostic (they inject fakes), so they need no changes.</w:t>
+      </w:r>
+    </w:p>
+    <w:p>
+      <w:pPr>
+        <w:pStyle w:val="FirstParagraph"/>
+      </w:pPr>
+      <w:r>
+        <w:rPr>
+          <w:b/>
+          <w:bCs/>
+        </w:rPr>
+        <w:t xml:space="preserve">What you do NOT touch:</w:t>
+      </w:r>
+      <w:r>
+        <w:t xml:space="preserve"> </w:t>
+      </w:r>
+      <w:r>
+        <w:t xml:space="preserve">the five agents, memory, audit log, guardrails, redactor, output formatter. They only ever see</w:t>
+      </w:r>
+      <w:r>
+        <w:t xml:space="preserve"> </w:t>
+      </w:r>
+      <w:r>
+        <w:rPr>
+          <w:rStyle w:val="VerbatimChar"/>
+        </w:rPr>
+        <w:t xml:space="preserve">call_for_json</w:t>
+      </w:r>
+      <w:r>
+        <w:t xml:space="preserve"> </w:t>
+      </w:r>
+      <w:r>
+        <w:t xml:space="preserve">— that’s the payoff of the abstraction, and a strong thing to point to in a code review.</w:t>
+      </w:r>
+    </w:p>
+    <w:p>
+      <w:r>
+        <w:pict>
+          <v:rect style="width:0;height:1.5pt" o:hralign="center" o:hrstd="t" o:hr="t"/>
+        </w:pict>
+      </w:r>
+    </w:p>
+    <w:bookmarkEnd w:id="177"/>
+    <w:bookmarkStart w:id="187" w:name="X76694f373c728f9ff9d67b74c467fd6ac5fdf5c"/>
+    <w:p>
+      <w:pPr>
+        <w:pStyle w:val="Heading2"/>
+      </w:pPr>
+      <w:r>
+        <w:t xml:space="preserve">Appendix N — Code-review walkthrough (interview prep)</w:t>
+      </w:r>
+    </w:p>
+    <w:p>
+      <w:pPr>
+        <w:pStyle w:val="FirstParagraph"/>
+      </w:pPr>
+      <w:r>
+        <w:t xml:space="preserve">A module-by-module guide for</w:t>
+      </w:r>
+      <w:r>
+        <w:t xml:space="preserve"> </w:t>
+      </w:r>
+      <w:r>
+        <w:t xml:space="preserve">“they’ll review the code.”</w:t>
+      </w:r>
+      <w:r>
+        <w:t xml:space="preserve"> </w:t>
+      </w:r>
+      <w:r>
+        <w:t xml:space="preserve">For each:</w:t>
+      </w:r>
+      <w:r>
+        <w:t xml:space="preserve"> </w:t>
+      </w:r>
+      <w:r>
+        <w:rPr>
+          <w:b/>
+          <w:bCs/>
+        </w:rPr>
+        <w:t xml:space="preserve">what it does</w:t>
+      </w:r>
+      <w:r>
+        <w:t xml:space="preserve">, the</w:t>
+      </w:r>
+      <w:r>
+        <w:t xml:space="preserve"> </w:t>
+      </w:r>
+      <w:r>
+        <w:rPr>
+          <w:b/>
+          <w:bCs/>
+        </w:rPr>
+        <w:t xml:space="preserve">design decisions</w:t>
+      </w:r>
+      <w:r>
+        <w:t xml:space="preserve"> </w:t>
+      </w:r>
+      <w:r>
+        <w:t xml:space="preserve">worth defending, and</w:t>
+      </w:r>
+      <w:r>
+        <w:t xml:space="preserve"> </w:t>
+      </w:r>
+      <w:r>
+        <w:rPr>
+          <w:b/>
+          <w:bCs/>
+        </w:rPr>
+        <w:t xml:space="preserve">likely questions</w:t>
+      </w:r>
+      <w:r>
+        <w:t xml:space="preserve">. Cross-cutting themes to lead with:</w:t>
+      </w:r>
+      <w:r>
+        <w:t xml:space="preserve"> </w:t>
+      </w:r>
+      <w:r>
+        <w:rPr>
+          <w:i/>
+          <w:iCs/>
+        </w:rPr>
+        <w:t xml:space="preserve">the LLM does judgment, deterministic Python does everything else; tools are injectable so the suite is fully mocked; errors degrade gracefully; every decision is audited.</w:t>
+      </w:r>
+    </w:p>
+    <w:bookmarkStart w:id="178" w:name="srcmain.py-cli-entry"/>
+    <w:p>
+      <w:pPr>
+        <w:pStyle w:val="Heading3"/>
+      </w:pPr>
+      <w:r>
+        <w:rPr>
+          <w:rStyle w:val="VerbatimChar"/>
+        </w:rPr>
+        <w:t xml:space="preserve">src/main.py</w:t>
+      </w:r>
+      <w:r>
+        <w:t xml:space="preserve"> </w:t>
+      </w:r>
+      <w:r>
+        <w:t xml:space="preserve">— CLI entry</w:t>
+      </w:r>
+    </w:p>
+    <w:p>
+      <w:pPr>
+        <w:pStyle w:val="FirstParagraph"/>
+      </w:pPr>
+      <w:r>
+        <w:t xml:space="preserve">Loads</w:t>
+      </w:r>
+      <w:r>
+        <w:t xml:space="preserve"> </w:t>
+      </w:r>
+      <w:r>
+        <w:rPr>
+          <w:rStyle w:val="VerbatimChar"/>
+        </w:rPr>
+        <w:t xml:space="preserve">.env</w:t>
+      </w:r>
+      <w:r>
+        <w:t xml:space="preserve">, promotes</w:t>
+      </w:r>
+      <w:r>
+        <w:t xml:space="preserve"> </w:t>
+      </w:r>
+      <w:r>
+        <w:rPr>
+          <w:rStyle w:val="VerbatimChar"/>
+        </w:rPr>
+        <w:t xml:space="preserve">JIRA_*</w:t>
+      </w:r>
+      <w:r>
+        <w:t xml:space="preserve"> </w:t>
+      </w:r>
+      <w:r>
+        <w:t xml:space="preserve">→</w:t>
+      </w:r>
+      <w:r>
+        <w:t xml:space="preserve"> </w:t>
+      </w:r>
+      <w:r>
+        <w:rPr>
+          <w:rStyle w:val="VerbatimChar"/>
+        </w:rPr>
+        <w:t xml:space="preserve">CONFLUENCE_*</w:t>
+      </w:r>
+      <w:r>
+        <w:t xml:space="preserve"> </w:t>
+      </w:r>
+      <w:r>
+        <w:t xml:space="preserve">(one Atlassian token), parses args, loads inputs via</w:t>
+      </w:r>
+      <w:r>
+        <w:t xml:space="preserve"> </w:t>
+      </w:r>
+      <w:r>
+        <w:rPr>
+          <w:rStyle w:val="VerbatimChar"/>
+        </w:rPr>
+        <w:t xml:space="preserve">input_loader</w:t>
+      </w:r>
+      <w:r>
+        <w:t xml:space="preserve">, runs</w:t>
+      </w:r>
+      <w:r>
+        <w:t xml:space="preserve"> </w:t>
+      </w:r>
+      <w:r>
+        <w:rPr>
+          <w:rStyle w:val="VerbatimChar"/>
+        </w:rPr>
+        <w:t xml:space="preserve">Orchestrator().run(...)</w:t>
+      </w:r>
+      <w:r>
+        <w:t xml:space="preserve">, writes</w:t>
+      </w:r>
+      <w:r>
+        <w:t xml:space="preserve"> </w:t>
+      </w:r>
+      <w:r>
+        <w:rPr>
+          <w:rStyle w:val="VerbatimChar"/>
+        </w:rPr>
+        <w:t xml:space="preserve">synthesis.json/.md</w:t>
+      </w:r>
+      <w:r>
+        <w:t xml:space="preserve"> </w:t>
+      </w:r>
+      <w:r>
+        <w:t xml:space="preserve">+</w:t>
+      </w:r>
+      <w:r>
+        <w:t xml:space="preserve"> </w:t>
+      </w:r>
+      <w:r>
+        <w:rPr>
+          <w:rStyle w:val="VerbatimChar"/>
+        </w:rPr>
+        <w:t xml:space="preserve">audit_trail.md</w:t>
+      </w:r>
+      <w:r>
+        <w:t xml:space="preserve">, and (with</w:t>
+      </w:r>
+      <w:r>
+        <w:t xml:space="preserve"> </w:t>
+      </w:r>
+      <w:r>
+        <w:rPr>
+          <w:rStyle w:val="VerbatimChar"/>
+        </w:rPr>
+        <w:t xml:space="preserve">--publish-jira</w:t>
+      </w:r>
+      <w:r>
+        <w:t xml:space="preserve">) publishes to Jira. Exit codes: 0 ok, 2 input error, 3 orchestrator error.</w:t>
+      </w:r>
+      <w:r>
+        <w:t xml:space="preserve"> </w:t>
+      </w:r>
+      <w:r>
+        <w:rPr>
+          <w:i/>
+          <w:iCs/>
+        </w:rPr>
+        <w:t xml:space="preserve">Likely Q:</w:t>
+      </w:r>
+      <w:r>
+        <w:t xml:space="preserve"> </w:t>
+      </w:r>
+      <w:r>
+        <w:t xml:space="preserve">“How does a PDF transcript get handled?”</w:t>
+      </w:r>
+      <w:r>
+        <w:t xml:space="preserve"> </w:t>
+      </w:r>
+      <w:r>
+        <w:t xml:space="preserve">→</w:t>
+      </w:r>
+      <w:r>
+        <w:t xml:space="preserve"> </w:t>
+      </w:r>
+      <w:r>
+        <w:rPr>
+          <w:rStyle w:val="VerbatimChar"/>
+        </w:rPr>
+        <w:t xml:space="preserve">load_text</w:t>
+      </w:r>
+      <w:r>
+        <w:t xml:space="preserve"> </w:t>
+      </w:r>
+      <w:r>
+        <w:t xml:space="preserve">lazy-imports</w:t>
+      </w:r>
+      <w:r>
+        <w:t xml:space="preserve"> </w:t>
+      </w:r>
+      <w:r>
+        <w:rPr>
+          <w:rStyle w:val="VerbatimChar"/>
+        </w:rPr>
+        <w:t xml:space="preserve">pypdf</w:t>
+      </w:r>
+      <w:r>
+        <w:t xml:space="preserve">, joins pages, raises</w:t>
+      </w:r>
+      <w:r>
+        <w:t xml:space="preserve"> </w:t>
+      </w:r>
+      <w:r>
+        <w:rPr>
+          <w:rStyle w:val="VerbatimChar"/>
+        </w:rPr>
+        <w:t xml:space="preserve">InputError</w:t>
+      </w:r>
+      <w:r>
+        <w:t xml:space="preserve"> </w:t>
+      </w:r>
+      <w:r>
+        <w:t xml:space="preserve">with an OCR hint on image-only PDFs.</w:t>
+      </w:r>
+    </w:p>
+    <w:bookmarkEnd w:id="178"/>
+    <w:bookmarkStart w:id="179" w:name="Xb503aec8e433bbd863c0180e106d140d7857ea9"/>
+    <w:p>
+      <w:pPr>
+        <w:pStyle w:val="Heading3"/>
+      </w:pPr>
+      <w:r>
+        <w:rPr>
+          <w:rStyle w:val="VerbatimChar"/>
+        </w:rPr>
+        <w:t xml:space="preserve">src/orchestrator.py</w:t>
+      </w:r>
+      <w:r>
+        <w:t xml:space="preserve"> </w:t>
+      </w:r>
+      <w:r>
+        <w:t xml:space="preserve">— the coordinator (read this one closely)</w:t>
+      </w:r>
+    </w:p>
+    <w:p>
+      <w:pPr>
+        <w:pStyle w:val="FirstParagraph"/>
+      </w:pPr>
+      <w:r>
+        <w:t xml:space="preserve">Constructs a fresh</w:t>
+      </w:r>
+      <w:r>
+        <w:t xml:space="preserve"> </w:t>
+      </w:r>
+      <w:r>
+        <w:rPr>
+          <w:rStyle w:val="VerbatimChar"/>
+        </w:rPr>
+        <w:t xml:space="preserve">MemoryStore</w:t>
+      </w:r>
+      <w:r>
+        <w:t xml:space="preserve"> </w:t>
+      </w:r>
+      <w:r>
+        <w:t xml:space="preserve">+</w:t>
+      </w:r>
+      <w:r>
+        <w:t xml:space="preserve"> </w:t>
+      </w:r>
+      <w:r>
+        <w:rPr>
+          <w:rStyle w:val="VerbatimChar"/>
+        </w:rPr>
+        <w:t xml:space="preserve">AuditLog</w:t>
+      </w:r>
+      <w:r>
+        <w:t xml:space="preserve"> </w:t>
+      </w:r>
+      <w:r>
+        <w:t xml:space="preserve">per run (no cross-run state), resolves</w:t>
+      </w:r>
+      <w:r>
+        <w:t xml:space="preserve"> </w:t>
+      </w:r>
+      <w:r>
+        <w:rPr>
+          <w:b/>
+          <w:bCs/>
+        </w:rPr>
+        <w:t xml:space="preserve">per-stage models</w:t>
+      </w:r>
+      <w:r>
+        <w:t xml:space="preserve">, applies the</w:t>
+      </w:r>
+      <w:r>
+        <w:t xml:space="preserve"> </w:t>
+      </w:r>
+      <w:r>
+        <w:rPr>
+          <w:b/>
+          <w:bCs/>
+        </w:rPr>
+        <w:t xml:space="preserve">vision auto-switch</w:t>
+      </w:r>
+      <w:r>
+        <w:t xml:space="preserve"> </w:t>
+      </w:r>
+      <w:r>
+        <w:t xml:space="preserve">and optional</w:t>
+      </w:r>
+      <w:r>
+        <w:t xml:space="preserve"> </w:t>
+      </w:r>
+      <w:r>
+        <w:rPr>
+          <w:b/>
+          <w:bCs/>
+        </w:rPr>
+        <w:t xml:space="preserve">PII redaction</w:t>
+      </w:r>
+      <w:r>
+        <w:t xml:space="preserve"> </w:t>
+      </w:r>
+      <w:r>
+        <w:t xml:space="preserve">+ live fetches, then runs the five stages in fixed order. Each stage:</w:t>
+      </w:r>
+      <w:r>
+        <w:t xml:space="preserve"> </w:t>
+      </w:r>
+      <w:r>
+        <w:rPr>
+          <w:rStyle w:val="VerbatimChar"/>
+        </w:rPr>
+        <w:t xml:space="preserve">_emit("started")</w:t>
+      </w:r>
+      <w:r>
+        <w:t xml:space="preserve"> </w:t>
+      </w:r>
+      <w:r>
+        <w:t xml:space="preserve">→ build the tool (</w:t>
+      </w:r>
+      <w:r>
+        <w:rPr>
+          <w:rStyle w:val="VerbatimChar"/>
+        </w:rPr>
+        <w:t xml:space="preserve">_tool_for</w:t>
+      </w:r>
+      <w:r>
+        <w:t xml:space="preserve">) →</w:t>
+      </w:r>
+      <w:r>
+        <w:t xml:space="preserve"> </w:t>
+      </w:r>
+      <w:r>
+        <w:rPr>
+          <w:rStyle w:val="VerbatimChar"/>
+        </w:rPr>
+        <w:t xml:space="preserve">agent.run()</w:t>
+      </w:r>
+      <w:r>
+        <w:t xml:space="preserve"> </w:t>
+      </w:r>
+      <w:r>
+        <w:t xml:space="preserve">→</w:t>
+      </w:r>
+      <w:r>
+        <w:t xml:space="preserve"> </w:t>
+      </w:r>
+      <w:r>
+        <w:rPr>
+          <w:rStyle w:val="VerbatimChar"/>
+        </w:rPr>
+        <w:t xml:space="preserve">_emit("completed")</w:t>
+      </w:r>
+      <w:r>
+        <w:t xml:space="preserve">; on</w:t>
+      </w:r>
+      <w:r>
+        <w:t xml:space="preserve"> </w:t>
+      </w:r>
+      <w:r>
+        <w:rPr>
+          <w:rStyle w:val="VerbatimChar"/>
+        </w:rPr>
+        <w:t xml:space="preserve">AgentError</w:t>
+      </w:r>
+      <w:r>
+        <w:t xml:space="preserve"> </w:t>
+      </w:r>
+      <w:r>
+        <w:t xml:space="preserve">it calls</w:t>
+      </w:r>
+      <w:r>
+        <w:t xml:space="preserve"> </w:t>
+      </w:r>
+      <w:r>
+        <w:rPr>
+          <w:rStyle w:val="VerbatimChar"/>
+        </w:rPr>
+        <w:t xml:space="preserve">_attempt_failover</w:t>
+      </w:r>
+      <w:r>
+        <w:t xml:space="preserve"> </w:t>
+      </w:r>
+      <w:r>
+        <w:t xml:space="preserve">(retry on the other provider, gated by</w:t>
+      </w:r>
+      <w:r>
+        <w:t xml:space="preserve"> </w:t>
+      </w:r>
+      <w:r>
+        <w:rPr>
+          <w:rStyle w:val="VerbatimChar"/>
+        </w:rPr>
+        <w:t xml:space="preserve">auto_switch</w:t>
+      </w:r>
+      <w:r>
+        <w:t xml:space="preserve">). Ends by aggregating token usage, assembling the result dict, un-redacting the output, and running guardrails. Key helpers:</w:t>
+      </w:r>
+      <w:r>
+        <w:t xml:space="preserve"> </w:t>
+      </w:r>
+      <w:r>
+        <w:rPr>
+          <w:rStyle w:val="VerbatimChar"/>
+        </w:rPr>
+        <w:t xml:space="preserve">_build_tool_for_model</w:t>
+      </w:r>
+      <w:r>
+        <w:t xml:space="preserve"> </w:t>
+      </w:r>
+      <w:r>
+        <w:t xml:space="preserve">(prefix dispatch),</w:t>
+      </w:r>
+      <w:r>
+        <w:t xml:space="preserve"> </w:t>
+      </w:r>
+      <w:r>
+        <w:rPr>
+          <w:rStyle w:val="VerbatimChar"/>
+        </w:rPr>
+        <w:t xml:space="preserve">_fallback_model</w:t>
+      </w:r>
+      <w:r>
+        <w:t xml:space="preserve">,</w:t>
+      </w:r>
+      <w:r>
+        <w:t xml:space="preserve"> </w:t>
+      </w:r>
+      <w:r>
+        <w:rPr>
+          <w:rStyle w:val="VerbatimChar"/>
+        </w:rPr>
+        <w:t xml:space="preserve">_attempt_failover</w:t>
+      </w:r>
+      <w:r>
+        <w:t xml:space="preserve">,</w:t>
+      </w:r>
+      <w:r>
+        <w:t xml:space="preserve"> </w:t>
+      </w:r>
+      <w:r>
+        <w:rPr>
+          <w:rStyle w:val="VerbatimChar"/>
+        </w:rPr>
+        <w:t xml:space="preserve">run_compare</w:t>
+      </w:r>
+      <w:r>
+        <w:t xml:space="preserve"> </w:t>
+      </w:r>
+      <w:r>
+        <w:t xml:space="preserve">(two providers, sequential).</w:t>
+      </w:r>
+      <w:r>
+        <w:t xml:space="preserve"> </w:t>
+      </w:r>
+      <w:r>
+        <w:rPr>
+          <w:i/>
+          <w:iCs/>
+        </w:rPr>
+        <w:t xml:space="preserve">Likely Q:</w:t>
+      </w:r>
+      <w:r>
+        <w:t xml:space="preserve"> </w:t>
+      </w:r>
+      <w:r>
+        <w:t xml:space="preserve">“Why is it a fixed pipeline, not autonomous?”</w:t>
+      </w:r>
+      <w:r>
+        <w:t xml:space="preserve"> </w:t>
+      </w:r>
+      <w:r>
+        <w:t xml:space="preserve">(reproducibility/cost/audit) ·</w:t>
+      </w:r>
+      <w:r>
+        <w:t xml:space="preserve"> </w:t>
+      </w:r>
+      <w:r>
+        <w:t xml:space="preserve">“What happens if stage 3 fails?”</w:t>
+      </w:r>
+      <w:r>
+        <w:t xml:space="preserve"> </w:t>
+      </w:r>
+      <w:r>
+        <w:t xml:space="preserve">(recorded, downstream skipped, partial result returned — or failover if enabled).</w:t>
+      </w:r>
+    </w:p>
+    <w:bookmarkEnd w:id="179"/>
+    <w:bookmarkStart w:id="180" w:name="srcagentsbase.py-the-five-agents"/>
+    <w:p>
+      <w:pPr>
+        <w:pStyle w:val="Heading3"/>
+      </w:pPr>
+      <w:r>
+        <w:rPr>
+          <w:rStyle w:val="VerbatimChar"/>
+        </w:rPr>
+        <w:t xml:space="preserve">src/agents/base.py</w:t>
+      </w:r>
+      <w:r>
+        <w:t xml:space="preserve"> </w:t>
+      </w:r>
+      <w:r>
+        <w:t xml:space="preserve">+ the five agents</w:t>
+      </w:r>
+    </w:p>
+    <w:p>
+      <w:pPr>
+        <w:pStyle w:val="FirstParagraph"/>
+      </w:pPr>
+      <w:r>
+        <w:rPr>
+          <w:rStyle w:val="VerbatimChar"/>
+        </w:rPr>
+        <w:t xml:space="preserve">Agent</w:t>
+      </w:r>
+      <w:r>
+        <w:t xml:space="preserve"> </w:t>
+      </w:r>
+      <w:r>
+        <w:t xml:space="preserve">base:</w:t>
+      </w:r>
+      <w:r>
+        <w:t xml:space="preserve"> </w:t>
+      </w:r>
+      <w:r>
+        <w:rPr>
+          <w:rStyle w:val="VerbatimChar"/>
+        </w:rPr>
+        <w:t xml:space="preserve">name</w:t>
+      </w:r>
+      <w:r>
+        <w:t xml:space="preserve">,</w:t>
+      </w:r>
+      <w:r>
+        <w:t xml:space="preserve"> </w:t>
+      </w:r>
+      <w:r>
+        <w:rPr>
+          <w:rStyle w:val="VerbatimChar"/>
+        </w:rPr>
+        <w:t xml:space="preserve">memory</w:t>
+      </w:r>
+      <w:r>
+        <w:t xml:space="preserve">,</w:t>
+      </w:r>
+      <w:r>
+        <w:t xml:space="preserve"> </w:t>
+      </w:r>
+      <w:r>
+        <w:rPr>
+          <w:rStyle w:val="VerbatimChar"/>
+        </w:rPr>
+        <w:t xml:space="preserve">audit</w:t>
+      </w:r>
+      <w:r>
+        <w:t xml:space="preserve">,</w:t>
+      </w:r>
+      <w:r>
+        <w:t xml:space="preserve"> </w:t>
+      </w:r>
+      <w:r>
+        <w:rPr>
+          <w:rStyle w:val="VerbatimChar"/>
+        </w:rPr>
+        <w:t xml:space="preserve">load_prompt()</w:t>
+      </w:r>
+      <w:r>
+        <w:t xml:space="preserve">,</w:t>
+      </w:r>
+      <w:r>
+        <w:t xml:space="preserve"> </w:t>
+      </w:r>
+      <w:r>
+        <w:rPr>
+          <w:rStyle w:val="VerbatimChar"/>
+        </w:rPr>
+        <w:t xml:space="preserve">emit()</w:t>
+      </w:r>
+      <w:r>
+        <w:t xml:space="preserve">. Every agent follows the same shape:</w:t>
+      </w:r>
+      <w:r>
+        <w:t xml:space="preserve"> </w:t>
+      </w:r>
+      <w:r>
+        <w:rPr>
+          <w:b/>
+          <w:bCs/>
+        </w:rPr>
+        <w:t xml:space="preserve">substitute the prompt →</w:t>
+      </w:r>
+      <w:r>
+        <w:rPr>
+          <w:b/>
+          <w:bCs/>
+        </w:rPr>
+        <w:t xml:space="preserve"> </w:t>
+      </w:r>
+      <w:r>
+        <w:rPr>
+          <w:rStyle w:val="VerbatimChar"/>
+          <w:b/>
+          <w:bCs/>
+        </w:rPr>
+        <w:t xml:space="preserve">call_for_json</w:t>
+      </w:r>
+      <w:r>
+        <w:rPr>
+          <w:b/>
+          <w:bCs/>
+        </w:rPr>
+        <w:t xml:space="preserve"> </w:t>
+      </w:r>
+      <w:r>
+        <w:rPr>
+          <w:b/>
+          <w:bCs/>
+        </w:rPr>
+        <w:t xml:space="preserve">→ assign deterministic IDs → write to memory →</w:t>
+      </w:r>
+      <w:r>
+        <w:rPr>
+          <w:b/>
+          <w:bCs/>
+        </w:rPr>
+        <w:t xml:space="preserve"> </w:t>
+      </w:r>
+      <w:r>
+        <w:rPr>
+          <w:rStyle w:val="VerbatimChar"/>
+          <w:b/>
+          <w:bCs/>
+        </w:rPr>
+        <w:t xml:space="preserve">record_tool_call</w:t>
+      </w:r>
+      <w:r>
+        <w:t xml:space="preserve">. Specifics: the</w:t>
+      </w:r>
+      <w:r>
+        <w:t xml:space="preserve"> </w:t>
+      </w:r>
+      <w:r>
+        <w:rPr>
+          <w:b/>
+          <w:bCs/>
+        </w:rPr>
+        <w:t xml:space="preserve">Parser</w:t>
+      </w:r>
+      <w:r>
+        <w:t xml:space="preserve"> </w:t>
+      </w:r>
+      <w:r>
+        <w:t xml:space="preserve">forwards images when the tool supports them; the</w:t>
+      </w:r>
+      <w:r>
+        <w:t xml:space="preserve"> </w:t>
+      </w:r>
+      <w:r>
+        <w:rPr>
+          <w:b/>
+          <w:bCs/>
+        </w:rPr>
+        <w:t xml:space="preserve">Story Writer</w:t>
+      </w:r>
+      <w:r>
+        <w:t xml:space="preserve"> </w:t>
+      </w:r>
+      <w:r>
+        <w:t xml:space="preserve">post-attaches the</w:t>
+      </w:r>
+      <w:r>
+        <w:t xml:space="preserve"> </w:t>
+      </w:r>
+      <w:r>
+        <w:rPr>
+          <w:rStyle w:val="VerbatimChar"/>
+        </w:rPr>
+        <w:t xml:space="preserve">evidence</w:t>
+      </w:r>
+      <w:r>
+        <w:t xml:space="preserve"> </w:t>
+      </w:r>
+      <w:r>
+        <w:t xml:space="preserve">block from the cited topic (so it can’t be hallucinated); the</w:t>
+      </w:r>
+      <w:r>
+        <w:t xml:space="preserve"> </w:t>
+      </w:r>
+      <w:r>
+        <w:rPr>
+          <w:b/>
+          <w:bCs/>
+        </w:rPr>
+        <w:t xml:space="preserve">Gap Detector</w:t>
+      </w:r>
+      <w:r>
+        <w:t xml:space="preserve"> </w:t>
+      </w:r>
+      <w:r>
+        <w:t xml:space="preserve">is hybrid — embeddings for duplicates (no LLM), LLM for conflicts + gaps, with a</w:t>
+      </w:r>
+      <w:r>
+        <w:t xml:space="preserve"> </w:t>
+      </w:r>
+      <w:r>
+        <w:rPr>
+          <w:rStyle w:val="VerbatimChar"/>
+        </w:rPr>
+        <w:t xml:space="preserve">G-NN</w:t>
+      </w:r>
+      <w:r>
+        <w:t xml:space="preserve"> </w:t>
+      </w:r>
+      <w:r>
+        <w:t xml:space="preserve">id backstop.</w:t>
+      </w:r>
+      <w:r>
+        <w:t xml:space="preserve"> </w:t>
+      </w:r>
+      <w:r>
+        <w:rPr>
+          <w:i/>
+          <w:iCs/>
+        </w:rPr>
+        <w:t xml:space="preserve">Likely Q:</w:t>
+      </w:r>
+      <w:r>
+        <w:t xml:space="preserve"> </w:t>
+      </w:r>
+      <w:r>
+        <w:t xml:space="preserve">“Why assign IDs in Python, not let the model?”</w:t>
+      </w:r>
+      <w:r>
+        <w:t xml:space="preserve"> </w:t>
+      </w:r>
+      <w:r>
+        <w:t xml:space="preserve">(determinism, no hallucinated/duplicate ids) ·</w:t>
+      </w:r>
+      <w:r>
+        <w:t xml:space="preserve"> </w:t>
+      </w:r>
+      <w:r>
+        <w:t xml:space="preserve">“Why a separate Parser?”</w:t>
+      </w:r>
+      <w:r>
+        <w:t xml:space="preserve"> </w:t>
+      </w:r>
+      <w:r>
+        <w:t xml:space="preserve">(single responsibility + reusable topic anchors for traceability).</w:t>
+      </w:r>
+    </w:p>
+    <w:bookmarkEnd w:id="180"/>
+    <w:bookmarkStart w:id="181" w:name="srctools-provider-integration-wrappers"/>
+    <w:p>
+      <w:pPr>
+        <w:pStyle w:val="Heading3"/>
+      </w:pPr>
+      <w:r>
+        <w:rPr>
+          <w:rStyle w:val="VerbatimChar"/>
+        </w:rPr>
+        <w:t xml:space="preserve">src/tools/</w:t>
+      </w:r>
+      <w:r>
+        <w:t xml:space="preserve"> </w:t>
+      </w:r>
+      <w:r>
+        <w:t xml:space="preserve">— provider + integration wrappers</w:t>
+      </w:r>
+    </w:p>
+    <w:p>
+      <w:pPr>
+        <w:pStyle w:val="FirstParagraph"/>
+      </w:pPr>
+      <w:r>
+        <w:rPr>
+          <w:rStyle w:val="VerbatimChar"/>
+        </w:rPr>
+        <w:t xml:space="preserve">base.py</w:t>
+      </w:r>
+      <w:r>
+        <w:t xml:space="preserve">:</w:t>
+      </w:r>
+      <w:r>
+        <w:t xml:space="preserve"> </w:t>
+      </w:r>
+      <w:r>
+        <w:rPr>
+          <w:rStyle w:val="VerbatimChar"/>
+        </w:rPr>
+        <w:t xml:space="preserve">Tool</w:t>
+      </w:r>
+      <w:r>
+        <w:t xml:space="preserve">,</w:t>
+      </w:r>
+      <w:r>
+        <w:t xml:space="preserve"> </w:t>
+      </w:r>
+      <w:r>
+        <w:rPr>
+          <w:rStyle w:val="VerbatimChar"/>
+        </w:rPr>
+        <w:t xml:space="preserve">ToolError</w:t>
+      </w:r>
+      <w:r>
+        <w:t xml:space="preserve">,</w:t>
+      </w:r>
+      <w:r>
+        <w:t xml:space="preserve"> </w:t>
+      </w:r>
+      <w:r>
+        <w:rPr>
+          <w:rStyle w:val="VerbatimChar"/>
+        </w:rPr>
+        <w:t xml:space="preserve">VisionAttachment</w:t>
+      </w:r>
+      <w:r>
+        <w:t xml:space="preserve"> </w:t>
+      </w:r>
+      <w:r>
+        <w:t xml:space="preserve">(</w:t>
+      </w:r>
+      <w:r>
+        <w:rPr>
+          <w:rStyle w:val="VerbatimChar"/>
+        </w:rPr>
+        <w:t xml:space="preserve">from_path</w:t>
+      </w:r>
+      <w:r>
+        <w:t xml:space="preserve">/</w:t>
+      </w:r>
+      <w:r>
+        <w:rPr>
+          <w:rStyle w:val="VerbatimChar"/>
+        </w:rPr>
+        <w:t xml:space="preserve">from_bytes</w:t>
+      </w:r>
+      <w:r>
+        <w:t xml:space="preserve">).</w:t>
+      </w:r>
+      <w:r>
+        <w:t xml:space="preserve"> </w:t>
+      </w:r>
+      <w:r>
+        <w:rPr>
+          <w:rStyle w:val="VerbatimChar"/>
+        </w:rPr>
+        <w:t xml:space="preserve">claude_tool.py</w:t>
+      </w:r>
+      <w:r>
+        <w:t xml:space="preserve">: Anthropic client, shared</w:t>
+      </w:r>
+      <w:r>
+        <w:t xml:space="preserve"> </w:t>
+      </w:r>
+      <w:r>
+        <w:rPr>
+          <w:rStyle w:val="VerbatimChar"/>
+        </w:rPr>
+        <w:t xml:space="preserve">system</w:t>
+      </w:r>
+      <w:r>
+        <w:t xml:space="preserve"> </w:t>
+      </w:r>
+      <w:r>
+        <w:t xml:space="preserve">prompt,</w:t>
+      </w:r>
+      <w:r>
+        <w:t xml:space="preserve"> </w:t>
+      </w:r>
+      <w:r>
+        <w:rPr>
+          <w:rStyle w:val="VerbatimChar"/>
+        </w:rPr>
+        <w:t xml:space="preserve">_call_with_retry</w:t>
+      </w:r>
+      <w:r>
+        <w:t xml:space="preserve"> </w:t>
+      </w:r>
+      <w:r>
+        <w:t xml:space="preserve">(tenacity, retries only transient errors), multimodal content array, and</w:t>
+      </w:r>
+      <w:r>
+        <w:t xml:space="preserve"> </w:t>
+      </w:r>
+      <w:r>
+        <w:rPr>
+          <w:rStyle w:val="VerbatimChar"/>
+        </w:rPr>
+        <w:t xml:space="preserve">_extract_json_block</w:t>
+      </w:r>
+      <w:r>
+        <w:t xml:space="preserve"> </w:t>
+      </w:r>
+      <w:r>
+        <w:t xml:space="preserve">(tries a fenced block, then the first</w:t>
+      </w:r>
+      <w:r>
+        <w:t xml:space="preserve"> </w:t>
+      </w:r>
+      <w:r>
+        <w:rPr>
+          <w:rStyle w:val="VerbatimChar"/>
+        </w:rPr>
+        <w:t xml:space="preserve">{…}</w:t>
+      </w:r>
+      <w:r>
+        <w:t xml:space="preserve"> </w:t>
+      </w:r>
+      <w:r>
+        <w:t xml:space="preserve">span).</w:t>
+      </w:r>
+      <w:r>
+        <w:t xml:space="preserve"> </w:t>
+      </w:r>
+      <w:r>
+        <w:rPr>
+          <w:rStyle w:val="VerbatimChar"/>
+        </w:rPr>
+        <w:t xml:space="preserve">gemini_tool.py</w:t>
+      </w:r>
+      <w:r>
+        <w:t xml:space="preserve">: same</w:t>
+      </w:r>
+      <w:r>
+        <w:t xml:space="preserve"> </w:t>
+      </w:r>
+      <w:r>
+        <w:rPr>
+          <w:rStyle w:val="VerbatimChar"/>
+        </w:rPr>
+        <w:t xml:space="preserve">call_for_json</w:t>
+      </w:r>
+      <w:r>
+        <w:t xml:space="preserve"> </w:t>
+      </w:r>
+      <w:r>
+        <w:t xml:space="preserve">contract over</w:t>
+      </w:r>
+      <w:r>
+        <w:t xml:space="preserve"> </w:t>
+      </w:r>
+      <w:r>
+        <w:rPr>
+          <w:rStyle w:val="VerbatimChar"/>
+        </w:rPr>
+        <w:t xml:space="preserve">google-genai</w:t>
+      </w:r>
+      <w:r>
+        <w:t xml:space="preserve">.</w:t>
+      </w:r>
+      <w:r>
+        <w:t xml:space="preserve"> </w:t>
+      </w:r>
+      <w:r>
+        <w:rPr>
+          <w:rStyle w:val="VerbatimChar"/>
+        </w:rPr>
+        <w:t xml:space="preserve">embedding_tool.py</w:t>
+      </w:r>
+      <w:r>
+        <w:t xml:space="preserve">: lazy</w:t>
+      </w:r>
+      <w:r>
+        <w:t xml:space="preserve"> </w:t>
+      </w:r>
+      <w:r>
+        <w:rPr>
+          <w:rStyle w:val="VerbatimChar"/>
+        </w:rPr>
+        <w:t xml:space="preserve">all-MiniLM-L6-v2</w:t>
+      </w:r>
+      <w:r>
+        <w:t xml:space="preserve">,</w:t>
+      </w:r>
+      <w:r>
+        <w:t xml:space="preserve"> </w:t>
+      </w:r>
+      <w:r>
+        <w:rPr>
+          <w:rStyle w:val="VerbatimChar"/>
+        </w:rPr>
+        <w:t xml:space="preserve">find_duplicates</w:t>
+      </w:r>
+      <w:r>
+        <w:t xml:space="preserve"> </w:t>
+      </w:r>
+      <w:r>
+        <w:t xml:space="preserve">via normalized-vector cosine ≥ 0.6 (no LLM).</w:t>
+      </w:r>
+      <w:r>
+        <w:t xml:space="preserve"> </w:t>
+      </w:r>
+      <w:r>
+        <w:rPr>
+          <w:rStyle w:val="VerbatimChar"/>
+        </w:rPr>
+        <w:t xml:space="preserve">jira_tool.py</w:t>
+      </w:r>
+      <w:r>
+        <w:t xml:space="preserve">: mock (fixture) vs live (paginated JQL + ADF→text)</w:t>
+      </w:r>
+      <w:r>
+        <w:t xml:space="preserve"> </w:t>
+      </w:r>
+      <w:r>
+        <w:rPr>
+          <w:b/>
+          <w:bCs/>
+        </w:rPr>
+        <w:t xml:space="preserve">and write-back</w:t>
+      </w:r>
+      <w:r>
+        <w:t xml:space="preserve"> </w:t>
+      </w:r>
+      <w:r>
+        <w:t xml:space="preserve">(</w:t>
+      </w:r>
+      <w:r>
+        <w:rPr>
+          <w:rStyle w:val="VerbatimChar"/>
+        </w:rPr>
+        <w:t xml:space="preserve">create_issue</w:t>
+      </w:r>
+      <w:r>
+        <w:t xml:space="preserve"> </w:t>
+      </w:r>
+      <w:r>
+        <w:t xml:space="preserve">with progressive fallback,</w:t>
+      </w:r>
+      <w:r>
+        <w:t xml:space="preserve"> </w:t>
+      </w:r>
+      <w:r>
+        <w:rPr>
+          <w:rStyle w:val="VerbatimChar"/>
+        </w:rPr>
+        <w:t xml:space="preserve">publish_synthesis</w:t>
+      </w:r>
+      <w:r>
+        <w:t xml:space="preserve"> </w:t>
+      </w:r>
+      <w:r>
+        <w:t xml:space="preserve">building Epic→Story→Sub-task).</w:t>
+      </w:r>
+      <w:r>
+        <w:t xml:space="preserve"> </w:t>
+      </w:r>
+      <w:r>
+        <w:rPr>
+          <w:i/>
+          <w:iCs/>
+        </w:rPr>
+        <w:t xml:space="preserve">Likely Q:</w:t>
+      </w:r>
+      <w:r>
+        <w:t xml:space="preserve"> </w:t>
+      </w:r>
+      <w:r>
+        <w:t xml:space="preserve">“Why the regex JSON extraction instead of tool-use?”</w:t>
+      </w:r>
+      <w:r>
+        <w:t xml:space="preserve"> </w:t>
+      </w:r>
+      <w:r>
+        <w:t xml:space="preserve">(small, well-tested; tool-use is the documented next step) ·</w:t>
+      </w:r>
+      <w:r>
+        <w:t xml:space="preserve"> </w:t>
+      </w:r>
+      <w:r>
+        <w:t xml:space="preserve">“Why local embeddings?”</w:t>
+      </w:r>
+      <w:r>
+        <w:t xml:space="preserve"> </w:t>
+      </w:r>
+      <w:r>
+        <w:t xml:space="preserve">(free, offline, deterministic; dedup is similarity, not reasoning).</w:t>
+      </w:r>
+    </w:p>
+    <w:bookmarkEnd w:id="181"/>
+    <w:bookmarkStart w:id="182" w:name="srcmemory-store-audit"/>
+    <w:p>
+      <w:pPr>
+        <w:pStyle w:val="Heading3"/>
+      </w:pPr>
+      <w:r>
+        <w:rPr>
+          <w:rStyle w:val="VerbatimChar"/>
+        </w:rPr>
+        <w:t xml:space="preserve">src/memory/</w:t>
+      </w:r>
+      <w:r>
+        <w:t xml:space="preserve"> </w:t>
+      </w:r>
+      <w:r>
+        <w:t xml:space="preserve">— store + audit</w:t>
+      </w:r>
+    </w:p>
+    <w:p>
+      <w:pPr>
+        <w:pStyle w:val="FirstParagraph"/>
+      </w:pPr>
+      <w:r>
+        <w:rPr>
+          <w:rStyle w:val="VerbatimChar"/>
+        </w:rPr>
+        <w:t xml:space="preserve">store.py</w:t>
+      </w:r>
+      <w:r>
+        <w:t xml:space="preserve">: KV (</w:t>
+      </w:r>
+      <w:r>
+        <w:rPr>
+          <w:rStyle w:val="VerbatimChar"/>
+        </w:rPr>
+        <w:t xml:space="preserve">get</w:t>
+      </w:r>
+      <w:r>
+        <w:t xml:space="preserve">/</w:t>
+      </w:r>
+      <w:r>
+        <w:rPr>
+          <w:rStyle w:val="VerbatimChar"/>
+        </w:rPr>
+        <w:t xml:space="preserve">put</w:t>
+      </w:r>
+      <w:r>
+        <w:t xml:space="preserve">) for agent handoff + a vector layer (</w:t>
+      </w:r>
+      <w:r>
+        <w:rPr>
+          <w:rStyle w:val="VerbatimChar"/>
+        </w:rPr>
+        <w:t xml:space="preserve">index_tickets</w:t>
+      </w:r>
+      <w:r>
+        <w:t xml:space="preserve"> </w:t>
+      </w:r>
+      <w:r>
+        <w:t xml:space="preserve">only embeds at ≥ 20 tickets;</w:t>
+      </w:r>
+      <w:r>
+        <w:t xml:space="preserve"> </w:t>
+      </w:r>
+      <w:r>
+        <w:rPr>
+          <w:rStyle w:val="VerbatimChar"/>
+        </w:rPr>
+        <w:t xml:space="preserve">search_similar</w:t>
+      </w:r>
+      <w:r>
+        <w:t xml:space="preserve"> </w:t>
+      </w:r>
+      <w:r>
+        <w:t xml:space="preserve">returns top-K with</w:t>
+      </w:r>
+      <w:r>
+        <w:t xml:space="preserve"> </w:t>
+      </w:r>
+      <w:r>
+        <w:rPr>
+          <w:rStyle w:val="VerbatimChar"/>
+        </w:rPr>
+        <w:t xml:space="preserve">_similarity</w:t>
+      </w:r>
+      <w:r>
+        <w:t xml:space="preserve">); optional content-addressed</w:t>
+      </w:r>
+      <w:r>
+        <w:t xml:space="preserve"> </w:t>
+      </w:r>
+      <w:r>
+        <w:rPr>
+          <w:rStyle w:val="VerbatimChar"/>
+        </w:rPr>
+        <w:t xml:space="preserve">.npz</w:t>
+      </w:r>
+      <w:r>
+        <w:t xml:space="preserve"> </w:t>
+      </w:r>
+      <w:r>
+        <w:t xml:space="preserve">cache keyed by a SHA-256 of model + corpus (self-invalidating).</w:t>
+      </w:r>
+      <w:r>
+        <w:t xml:space="preserve"> </w:t>
+      </w:r>
+      <w:r>
+        <w:rPr>
+          <w:rStyle w:val="VerbatimChar"/>
+        </w:rPr>
+        <w:t xml:space="preserve">audit_log.py</w:t>
+      </w:r>
+      <w:r>
+        <w:t xml:space="preserve">: append-only</w:t>
+      </w:r>
+      <w:r>
+        <w:t xml:space="preserve"> </w:t>
+      </w:r>
+      <w:r>
+        <w:rPr>
+          <w:rStyle w:val="VerbatimChar"/>
+        </w:rPr>
+        <w:t xml:space="preserve">AuditEvent</w:t>
+      </w:r>
+      <w:r>
+        <w:t xml:space="preserve">s (</w:t>
+      </w:r>
+      <w:r>
+        <w:rPr>
+          <w:rStyle w:val="VerbatimChar"/>
+        </w:rPr>
+        <w:t xml:space="preserve">record</w:t>
+      </w:r>
+      <w:r>
+        <w:t xml:space="preserve">,</w:t>
+      </w:r>
+      <w:r>
+        <w:t xml:space="preserve"> </w:t>
+      </w:r>
+      <w:r>
+        <w:rPr>
+          <w:rStyle w:val="VerbatimChar"/>
+        </w:rPr>
+        <w:t xml:space="preserve">record_tool_call</w:t>
+      </w:r>
+      <w:r>
+        <w:t xml:space="preserve">,</w:t>
+      </w:r>
+      <w:r>
+        <w:t xml:space="preserve"> </w:t>
+      </w:r>
+      <w:r>
+        <w:rPr>
+          <w:rStyle w:val="VerbatimChar"/>
+        </w:rPr>
+        <w:t xml:space="preserve">record_failure</w:t>
+      </w:r>
+      <w:r>
+        <w:t xml:space="preserve">), rendered to Markdown with collapsible</w:t>
+      </w:r>
+      <w:r>
+        <w:t xml:space="preserve"> </w:t>
+      </w:r>
+      <w:r>
+        <w:rPr>
+          <w:rStyle w:val="VerbatimChar"/>
+        </w:rPr>
+        <w:t xml:space="preserve">&lt;details&gt;</w:t>
+      </w:r>
+      <w:r>
+        <w:t xml:space="preserve"> </w:t>
+      </w:r>
+      <w:r>
+        <w:t xml:space="preserve">prompt/response blocks.</w:t>
+      </w:r>
+      <w:r>
+        <w:t xml:space="preserve"> </w:t>
+      </w:r>
+      <w:r>
+        <w:rPr>
+          <w:i/>
+          <w:iCs/>
+        </w:rPr>
+        <w:t xml:space="preserve">Likely Q:</w:t>
+      </w:r>
+      <w:r>
+        <w:t xml:space="preserve"> </w:t>
+      </w:r>
+      <w:r>
+        <w:t xml:space="preserve">“How do agents share state?”</w:t>
+      </w:r>
+      <w:r>
+        <w:t xml:space="preserve"> </w:t>
+      </w:r>
+      <w:r>
+        <w:t xml:space="preserve">(a dict + a numpy index — never references to each other; the orchestrator owns sequencing).</w:t>
+      </w:r>
+    </w:p>
+    <w:bookmarkEnd w:id="182"/>
+    <w:bookmarkStart w:id="183" w:name="X914d93e4ccb44f3e8bb5135dd959711ec122209"/>
+    <w:p>
+      <w:pPr>
+        <w:pStyle w:val="Heading3"/>
+      </w:pPr>
+      <w:r>
+        <w:rPr>
+          <w:rStyle w:val="VerbatimChar"/>
+        </w:rPr>
+        <w:t xml:space="preserve">src/guardrails.py</w:t>
+      </w:r>
+      <w:r>
+        <w:t xml:space="preserve">,</w:t>
+      </w:r>
+      <w:r>
+        <w:t xml:space="preserve"> </w:t>
+      </w:r>
+      <w:r>
+        <w:rPr>
+          <w:rStyle w:val="VerbatimChar"/>
+        </w:rPr>
+        <w:t xml:space="preserve">src/redactor.py</w:t>
+      </w:r>
+      <w:r>
+        <w:t xml:space="preserve">,</w:t>
+      </w:r>
+      <w:r>
+        <w:t xml:space="preserve"> </w:t>
+      </w:r>
+      <w:r>
+        <w:rPr>
+          <w:rStyle w:val="VerbatimChar"/>
+        </w:rPr>
+        <w:t xml:space="preserve">src/pricing.py</w:t>
+      </w:r>
+    </w:p>
+    <w:p>
+      <w:pPr>
+        <w:pStyle w:val="FirstParagraph"/>
+      </w:pPr>
+      <w:r>
+        <w:t xml:space="preserve">Guardrails: six deterministic post-synthesis checks (AC count/grammar, unique titles, canonical tags, story grounding, priority-rationale rigor) → non-blocking findings, the two</w:t>
+      </w:r>
+      <w:r>
+        <w:t xml:space="preserve"> </w:t>
+      </w:r>
+      <w:r>
+        <w:rPr>
+          <w:rStyle w:val="VerbatimChar"/>
+        </w:rPr>
+        <w:t xml:space="preserve">error</w:t>
+      </w:r>
+      <w:r>
+        <w:t xml:space="preserve">-level ones are the deterministic hallucination catch. Redactor: regex PII (email/phone/SSN/card + conservative names) with stable placeholders + a strict-redact trust boundary. Pricing: per-model $/1M rates for the cost panel.</w:t>
+      </w:r>
+      <w:r>
+        <w:t xml:space="preserve"> </w:t>
+      </w:r>
+      <w:r>
+        <w:rPr>
+          <w:i/>
+          <w:iCs/>
+        </w:rPr>
+        <w:t xml:space="preserve">Likely Q:</w:t>
+      </w:r>
+      <w:r>
+        <w:t xml:space="preserve"> </w:t>
+      </w:r>
+      <w:r>
+        <w:t xml:space="preserve">“How do you catch hallucination deterministically?”</w:t>
+      </w:r>
+      <w:r>
+        <w:t xml:space="preserve"> </w:t>
+      </w:r>
+      <w:r>
+        <w:t xml:space="preserve">(the</w:t>
+      </w:r>
+      <w:r>
+        <w:t xml:space="preserve"> </w:t>
+      </w:r>
+      <w:r>
+        <w:rPr>
+          <w:rStyle w:val="VerbatimChar"/>
+        </w:rPr>
+        <w:t xml:space="preserve">ungrounded_story</w:t>
+      </w:r>
+      <w:r>
+        <w:t xml:space="preserve"> </w:t>
+      </w:r>
+      <w:r>
+        <w:t xml:space="preserve">/</w:t>
+      </w:r>
+      <w:r>
+        <w:t xml:space="preserve"> </w:t>
+      </w:r>
+      <w:r>
+        <w:rPr>
+          <w:rStyle w:val="VerbatimChar"/>
+        </w:rPr>
+        <w:t xml:space="preserve">dangling_topic_ref</w:t>
+      </w:r>
+      <w:r>
+        <w:t xml:space="preserve"> </w:t>
+      </w:r>
+      <w:r>
+        <w:t xml:space="preserve">guardrails).</w:t>
+      </w:r>
+    </w:p>
+    <w:bookmarkEnd w:id="183"/>
+    <w:bookmarkStart w:id="184" w:name="X8f01f877de7d44a6714bf80f13ad63b3df25b6b"/>
+    <w:p>
+      <w:pPr>
+        <w:pStyle w:val="Heading3"/>
+      </w:pPr>
+      <w:r>
+        <w:rPr>
+          <w:rStyle w:val="VerbatimChar"/>
+        </w:rPr>
+        <w:t xml:space="preserve">src/input_loader.py</w:t>
+      </w:r>
+      <w:r>
+        <w:t xml:space="preserve">,</w:t>
+      </w:r>
+      <w:r>
+        <w:t xml:space="preserve"> </w:t>
+      </w:r>
+      <w:r>
+        <w:rPr>
+          <w:rStyle w:val="VerbatimChar"/>
+        </w:rPr>
+        <w:t xml:space="preserve">src/output_formatter.py</w:t>
+      </w:r>
+    </w:p>
+    <w:p>
+      <w:pPr>
+        <w:pStyle w:val="FirstParagraph"/>
+      </w:pPr>
+      <w:r>
+        <w:t xml:space="preserve">Loader: txt/md (UTF-8 + latin-1 fallback), pdf (pypdf), json tickets (list or</w:t>
+      </w:r>
+      <w:r>
+        <w:t xml:space="preserve"> </w:t>
+      </w:r>
+      <w:r>
+        <w:rPr>
+          <w:rStyle w:val="VerbatimChar"/>
+        </w:rPr>
+        <w:t xml:space="preserve">{items:[…]}</w:t>
+      </w:r>
+      <w:r>
+        <w:t xml:space="preserve">), normalized shape. Formatter: renders the result to</w:t>
+      </w:r>
+      <w:r>
+        <w:t xml:space="preserve"> </w:t>
+      </w:r>
+      <w:r>
+        <w:rPr>
+          <w:rStyle w:val="VerbatimChar"/>
+        </w:rPr>
+        <w:t xml:space="preserve">synthesis.json</w:t>
+      </w:r>
+      <w:r>
+        <w:t xml:space="preserve"> </w:t>
+      </w:r>
+      <w:r>
+        <w:t xml:space="preserve">+ a hierarchical</w:t>
+      </w:r>
+      <w:r>
+        <w:t xml:space="preserve"> </w:t>
+      </w:r>
+      <w:r>
+        <w:rPr>
+          <w:rStyle w:val="VerbatimChar"/>
+        </w:rPr>
+        <w:t xml:space="preserve">synthesis.md</w:t>
+      </w:r>
+      <w:r>
+        <w:t xml:space="preserve"> </w:t>
+      </w:r>
+      <w:r>
+        <w:t xml:space="preserve">(epics → stories → tasks, then gaps/conflicts/duplicates).</w:t>
+      </w:r>
+    </w:p>
+    <w:bookmarkEnd w:id="184"/>
+    <w:bookmarkStart w:id="185" w:name="app.py-streamlit-ui"/>
+    <w:p>
+      <w:pPr>
+        <w:pStyle w:val="Heading3"/>
+      </w:pPr>
+      <w:r>
+        <w:rPr>
+          <w:rStyle w:val="VerbatimChar"/>
+        </w:rPr>
+        <w:t xml:space="preserve">app.py</w:t>
+      </w:r>
+      <w:r>
+        <w:t xml:space="preserve"> </w:t>
+      </w:r>
+      <w:r>
+        <w:t xml:space="preserve">— Streamlit UI</w:t>
+      </w:r>
+    </w:p>
+    <w:p>
+      <w:pPr>
+        <w:pStyle w:val="FirstParagraph"/>
+      </w:pPr>
+      <w:r>
+        <w:t xml:space="preserve">State in</w:t>
+      </w:r>
+      <w:r>
+        <w:t xml:space="preserve"> </w:t>
+      </w:r>
+      <w:r>
+        <w:rPr>
+          <w:rStyle w:val="VerbatimChar"/>
+        </w:rPr>
+        <w:t xml:space="preserve">st.session_state</w:t>
+      </w:r>
+      <w:r>
+        <w:t xml:space="preserve"> </w:t>
+      </w:r>
+      <w:r>
+        <w:t xml:space="preserve">(Streamlit re-runs the whole script per interaction). Sidebar = multi-select sources + always-visible uploaders + presets; the run handler defines a</w:t>
+      </w:r>
+      <w:r>
+        <w:t xml:space="preserve"> </w:t>
+      </w:r>
+      <w:r>
+        <w:rPr>
+          <w:rStyle w:val="VerbatimChar"/>
+        </w:rPr>
+        <w:t xml:space="preserve">progress_callback</w:t>
+      </w:r>
+      <w:r>
+        <w:t xml:space="preserve"> </w:t>
+      </w:r>
+      <w:r>
+        <w:t xml:space="preserve">that</w:t>
+      </w:r>
+      <w:r>
+        <w:t xml:space="preserve"> </w:t>
+      </w:r>
+      <w:r>
+        <w:rPr>
+          <w:b/>
+          <w:bCs/>
+        </w:rPr>
+        <w:t xml:space="preserve">accumulates</w:t>
+      </w:r>
+      <w:r>
+        <w:t xml:space="preserve"> </w:t>
+      </w:r>
+      <w:r>
+        <w:t xml:space="preserve">the live log and lights the pipeline; results render as KPI cards + tabs + downloads + Create-in-Jira; the top nav and dialogs reuse the same engine. The UI is a thin presentation layer — it calls the same</w:t>
+      </w:r>
+      <w:r>
+        <w:t xml:space="preserve"> </w:t>
+      </w:r>
+      <w:r>
+        <w:rPr>
+          <w:rStyle w:val="VerbatimChar"/>
+        </w:rPr>
+        <w:t xml:space="preserve">Orchestrator.run</w:t>
+      </w:r>
+      <w:r>
+        <w:t xml:space="preserve"> </w:t>
+      </w:r>
+      <w:r>
+        <w:t xml:space="preserve">the CLI does.</w:t>
+      </w:r>
+      <w:r>
+        <w:t xml:space="preserve"> </w:t>
+      </w:r>
+      <w:r>
+        <w:rPr>
+          <w:i/>
+          <w:iCs/>
+        </w:rPr>
+        <w:t xml:space="preserve">Likely Q:</w:t>
+      </w:r>
+      <w:r>
+        <w:t xml:space="preserve"> </w:t>
+      </w:r>
+      <w:r>
+        <w:t xml:space="preserve">“Why Streamlit?”</w:t>
+      </w:r>
+      <w:r>
+        <w:t xml:space="preserve"> </w:t>
+      </w:r>
+      <w:r>
+        <w:t xml:space="preserve">(Python-native, fast, server-rendered — no separate frontend) ·</w:t>
+      </w:r>
+      <w:r>
+        <w:t xml:space="preserve"> </w:t>
+      </w:r>
+      <w:r>
+        <w:t xml:space="preserve">“Is the UI tested?”</w:t>
+      </w:r>
+      <w:r>
+        <w:t xml:space="preserve"> </w:t>
+      </w:r>
+      <w:r>
+        <w:t xml:space="preserve">(the engine is; UI is a presentation wrapper over the tested orchestrator).</w:t>
+      </w:r>
+    </w:p>
+    <w:bookmarkEnd w:id="185"/>
+    <w:bookmarkStart w:id="186" w:name="evaluation-1"/>
+    <w:p>
+      <w:pPr>
+        <w:pStyle w:val="Heading3"/>
+      </w:pPr>
+      <w:r>
+        <w:rPr>
+          <w:rStyle w:val="VerbatimChar"/>
+        </w:rPr>
+        <w:t xml:space="preserve">evaluation/</w:t>
+      </w:r>
+    </w:p>
+    <w:p>
+      <w:pPr>
+        <w:pStyle w:val="FirstParagraph"/>
+      </w:pPr>
+      <w:r>
+        <w:rPr>
+          <w:rStyle w:val="VerbatimChar"/>
+        </w:rPr>
+        <w:t xml:space="preserve">metrics.py</w:t>
+      </w:r>
+      <w:r>
+        <w:t xml:space="preserve"> </w:t>
+      </w:r>
+      <w:r>
+        <w:t xml:space="preserve">(6 deterministic 0–1 scores),</w:t>
+      </w:r>
+      <w:r>
+        <w:t xml:space="preserve"> </w:t>
+      </w:r>
+      <w:r>
+        <w:rPr>
+          <w:rStyle w:val="VerbatimChar"/>
+        </w:rPr>
+        <w:t xml:space="preserve">llm_as_judge.py</w:t>
+      </w:r>
+      <w:r>
+        <w:t xml:space="preserve"> </w:t>
+      </w:r>
+      <w:r>
+        <w:t xml:space="preserve">(5 qualitative dims, normalized),</w:t>
+      </w:r>
+      <w:r>
+        <w:t xml:space="preserve"> </w:t>
+      </w:r>
+      <w:r>
+        <w:rPr>
+          <w:rStyle w:val="VerbatimChar"/>
+        </w:rPr>
+        <w:t xml:space="preserve">run_evaluation.py</w:t>
+      </w:r>
+      <w:r>
+        <w:t xml:space="preserve"> </w:t>
+      </w:r>
+      <w:r>
+        <w:t xml:space="preserve">(per-case runner, mockable orchestrator),</w:t>
+      </w:r>
+      <w:r>
+        <w:t xml:space="preserve"> </w:t>
+      </w:r>
+      <w:r>
+        <w:rPr>
+          <w:rStyle w:val="VerbatimChar"/>
+        </w:rPr>
+        <w:t xml:space="preserve">single_prompt_baseline.py</w:t>
+      </w:r>
+      <w:r>
+        <w:t xml:space="preserve"> </w:t>
+      </w:r>
+      <w:r>
+        <w:t xml:space="preserve">(the honest A/B),</w:t>
+      </w:r>
+      <w:r>
+        <w:t xml:space="preserve"> </w:t>
+      </w:r>
+      <w:r>
+        <w:rPr>
+          <w:rStyle w:val="VerbatimChar"/>
+        </w:rPr>
+        <w:t xml:space="preserve">dashboard.py</w:t>
+      </w:r>
+      <w:r>
+        <w:t xml:space="preserve"> </w:t>
+      </w:r>
+      <w:r>
+        <w:t xml:space="preserve">(regression detection),</w:t>
+      </w:r>
+      <w:r>
+        <w:t xml:space="preserve"> </w:t>
+      </w:r>
+      <w:r>
+        <w:rPr>
+          <w:rStyle w:val="VerbatimChar"/>
+        </w:rPr>
+        <w:t xml:space="preserve">ab_compare.py</w:t>
+      </w:r>
+      <w:r>
+        <w:t xml:space="preserve"> </w:t>
+      </w:r>
+      <w:r>
+        <w:t xml:space="preserve">(prompt experiments).</w:t>
+      </w:r>
+      <w:r>
+        <w:t xml:space="preserve"> </w:t>
+      </w:r>
+      <w:r>
+        <w:rPr>
+          <w:i/>
+          <w:iCs/>
+        </w:rPr>
+        <w:t xml:space="preserve">Likely Q:</w:t>
+      </w:r>
+      <w:r>
+        <w:t xml:space="preserve"> </w:t>
+      </w:r>
+      <w:r>
+        <w:t xml:space="preserve">“Why both deterministic and LLM-judge?”</w:t>
+      </w:r>
+      <w:r>
+        <w:t xml:space="preserve"> </w:t>
+      </w:r>
+      <w:r>
+        <w:t xml:space="preserve">(objective-but-shallow vs. subjective-but-deep; reporting both + explaining where they diverge is more honest — Appendix C).</w:t>
+      </w:r>
+    </w:p>
+    <w:p>
+      <w:pPr>
+        <w:pStyle w:val="BodyText"/>
+      </w:pPr>
+      <w:r>
+        <w:rPr>
+          <w:b/>
+          <w:bCs/>
+        </w:rPr>
+        <w:t xml:space="preserve">Code-review tips:</w:t>
+      </w:r>
+      <w:r>
+        <w:t xml:space="preserve"> </w:t>
+      </w:r>
+      <w:r>
+        <w:t xml:space="preserve">lead with the deterministic-vs-AI boundary; when asked</w:t>
+      </w:r>
+      <w:r>
+        <w:t xml:space="preserve"> </w:t>
+      </w:r>
+      <w:r>
+        <w:t xml:space="preserve">“where would X change?”</w:t>
+      </w:r>
+      <w:r>
+        <w:t xml:space="preserve">, point at the single owning module (e.g., a new provider →</w:t>
+      </w:r>
+      <w:r>
+        <w:t xml:space="preserve"> </w:t>
+      </w:r>
+      <w:r>
+        <w:rPr>
+          <w:rStyle w:val="VerbatimChar"/>
+        </w:rPr>
+        <w:t xml:space="preserve">_build_tool_for_model</w:t>
+      </w:r>
+      <w:r>
+        <w:t xml:space="preserve"> </w:t>
+      </w:r>
+      <w:r>
+        <w:t xml:space="preserve">+ a new tool, Appendix M); and be ready to name one thing you’d improve (tool-use for guaranteed JSON; two-way Jira sync; parallelizing the two independent stages).</w:t>
+      </w:r>
+    </w:p>
+    <w:bookmarkEnd w:id="186"/>
+    <w:bookmarkEnd w:id="187"/>
+    <w:bookmarkEnd w:id="188"/>
     <w:sectPr>
       <w:footnotePr>
         <w:numRestart w:val="eachSect"/>
@@ -37068,6 +40200,36 @@
     <w:abstractNumId w:val="991"/>
   </w:num>
   <w:num w:numId="1025">
+    <w:abstractNumId w:val="99411"/>
+    <w:lvlOverride w:ilvl="0">
+      <w:startOverride w:val="1"/>
+    </w:lvlOverride>
+    <w:lvlOverride w:ilvl="1">
+      <w:startOverride w:val="1"/>
+    </w:lvlOverride>
+    <w:lvlOverride w:ilvl="2">
+      <w:startOverride w:val="1"/>
+    </w:lvlOverride>
+    <w:lvlOverride w:ilvl="3">
+      <w:startOverride w:val="1"/>
+    </w:lvlOverride>
+    <w:lvlOverride w:ilvl="4">
+      <w:startOverride w:val="1"/>
+    </w:lvlOverride>
+    <w:lvlOverride w:ilvl="5">
+      <w:startOverride w:val="1"/>
+    </w:lvlOverride>
+    <w:lvlOverride w:ilvl="6">
+      <w:startOverride w:val="1"/>
+    </w:lvlOverride>
+    <w:lvlOverride w:ilvl="7">
+      <w:startOverride w:val="1"/>
+    </w:lvlOverride>
+    <w:lvlOverride w:ilvl="8">
+      <w:startOverride w:val="1"/>
+    </w:lvlOverride>
+  </w:num>
+  <w:num w:numId="1026">
     <w:abstractNumId w:val="99411"/>
     <w:lvlOverride w:ilvl="0">
       <w:startOverride w:val="1"/>

</xml_diff>

<commit_message>
docs: add Appendix O — how we validated Claude-generated code
Detailed 7-layer validation stack (static, 128 mocked tests, end-to-end runs,
behavioural eval, runtime guardrails, human review + verify-against-reality,
provenance) with concrete defects it caught (case_07 zero-stories, vision-on-
Gemini, v1_baseline mislabel, compare-mode Gemini, stale doc claims).
Regenerated docs/TECHNICAL_DOCUMENT.docx.

Co-Authored-By: Claude Opus 4.8 (1M context) <noreply@anthropic.com>
</commit_message>
<xml_diff>
--- a/docs/TECHNICAL_DOCUMENT.docx
+++ b/docs/TECHNICAL_DOCUMENT.docx
@@ -28,7 +28,7 @@
         </w:p>
       </w:sdtContent>
     </w:sdt>
-    <w:bookmarkStart w:id="188" w:name="X25610cb6729dae425b4d608f896666f92c57500"/>
+    <w:bookmarkStart w:id="193" w:name="X25610cb6729dae425b4d608f896666f92c57500"/>
     <w:p>
       <w:pPr>
         <w:pStyle w:val="Heading1"/>
@@ -861,6 +861,31 @@
       </w:r>
       <w:r>
         <w:t xml:space="preserve">— every module explained, for interview prep</w:t>
+      </w:r>
+    </w:p>
+    <w:p>
+      <w:pPr>
+        <w:pStyle w:val="Compact"/>
+        <w:numPr>
+          <w:ilvl w:val="0"/>
+          <w:numId w:val="1002"/>
+        </w:numPr>
+      </w:pPr>
+      <w:hyperlink w:anchor="Xb028a0e7c2bab071a1860720e9f06fbed04e1e8">
+        <w:r>
+          <w:rPr>
+            <w:rStyle w:val="Hyperlink"/>
+            <w:b/>
+            <w:bCs/>
+          </w:rPr>
+          <w:t xml:space="preserve">Appendix O — How we validated Claude-generated code</w:t>
+        </w:r>
+      </w:hyperlink>
+      <w:r>
+        <w:t xml:space="preserve"> </w:t>
+      </w:r>
+      <w:r>
+        <w:t xml:space="preserve">— the 7-layer validation stack + real defects it caught</w:t>
       </w:r>
     </w:p>
     <w:p>
@@ -39742,9 +39767,1188 @@
         <w:t xml:space="preserve">+ a new tool, Appendix M); and be ready to name one thing you’d improve (tool-use for guaranteed JSON; two-way Jira sync; parallelizing the two independent stages).</w:t>
       </w:r>
     </w:p>
+    <w:p>
+      <w:r>
+        <w:pict>
+          <v:rect style="width:0;height:1.5pt" o:hralign="center" o:hrstd="t" o:hr="t"/>
+        </w:pict>
+      </w:r>
+    </w:p>
     <w:bookmarkEnd w:id="186"/>
     <w:bookmarkEnd w:id="187"/>
+    <w:bookmarkStart w:id="192" w:name="X89f37db699a61bd6fcd85451d482e8812dfc9db"/>
+    <w:p>
+      <w:pPr>
+        <w:pStyle w:val="Heading2"/>
+      </w:pPr>
+      <w:r>
+        <w:t xml:space="preserve">Appendix O — How we validated the code Claude generated</w:t>
+      </w:r>
+    </w:p>
+    <w:p>
+      <w:pPr>
+        <w:pStyle w:val="FirstParagraph"/>
+      </w:pPr>
+      <w:r>
+        <w:t xml:space="preserve">Claude was the pair-programmer for most of this codebase (see §13). The guiding rule was</w:t>
+      </w:r>
+      <w:r>
+        <w:t xml:space="preserve"> </w:t>
+      </w:r>
+      <w:r>
+        <w:rPr>
+          <w:b/>
+          <w:bCs/>
+        </w:rPr>
+        <w:t xml:space="preserve">“trust nothing, verify everything”</w:t>
+      </w:r>
+      <w:r>
+        <w:t xml:space="preserve">: AI-generated code is treated like a pull request from a fast, capable junior — it doesn’t merge until it’s</w:t>
+      </w:r>
+      <w:r>
+        <w:t xml:space="preserve"> </w:t>
+      </w:r>
+      <w:r>
+        <w:rPr>
+          <w:i/>
+          <w:iCs/>
+        </w:rPr>
+        <w:t xml:space="preserve">proven</w:t>
+      </w:r>
+      <w:r>
+        <w:t xml:space="preserve"> </w:t>
+      </w:r>
+      <w:r>
+        <w:t xml:space="preserve">correct. Two structural choices make that verification cheap and rigorous:</w:t>
+      </w:r>
+    </w:p>
+    <w:p>
+      <w:pPr>
+        <w:pStyle w:val="Compact"/>
+        <w:numPr>
+          <w:ilvl w:val="0"/>
+          <w:numId w:val="1027"/>
+        </w:numPr>
+      </w:pPr>
+      <w:r>
+        <w:rPr>
+          <w:b/>
+          <w:bCs/>
+        </w:rPr>
+        <w:t xml:space="preserve">The deterministic-vs-AI boundary.</w:t>
+      </w:r>
+      <w:r>
+        <w:t xml:space="preserve"> </w:t>
+      </w:r>
+      <w:r>
+        <w:t xml:space="preserve">The LLM only produces structured JSON for five well-defined tasks;</w:t>
+      </w:r>
+      <w:r>
+        <w:t xml:space="preserve"> </w:t>
+      </w:r>
+      <w:r>
+        <w:rPr>
+          <w:i/>
+          <w:iCs/>
+        </w:rPr>
+        <w:t xml:space="preserve">everything around it</w:t>
+      </w:r>
+      <w:r>
+        <w:t xml:space="preserve"> </w:t>
+      </w:r>
+      <w:r>
+        <w:t xml:space="preserve">— orchestration, ID assignment, retrieval math, guardrails, redaction, formatting, cost — is plain Python. That deterministic majority is exhaustively testable, and its behaviour is identical in test and in production.</w:t>
+      </w:r>
+    </w:p>
+    <w:p>
+      <w:pPr>
+        <w:pStyle w:val="Compact"/>
+        <w:numPr>
+          <w:ilvl w:val="0"/>
+          <w:numId w:val="1027"/>
+        </w:numPr>
+      </w:pPr>
+      <w:r>
+        <w:rPr>
+          <w:b/>
+          <w:bCs/>
+        </w:rPr>
+        <w:t xml:space="preserve">Dependency injection on every tool.</w:t>
+      </w:r>
+      <w:r>
+        <w:t xml:space="preserve"> </w:t>
+      </w:r>
+      <w:r>
+        <w:t xml:space="preserve">Agents take a</w:t>
+      </w:r>
+      <w:r>
+        <w:t xml:space="preserve"> </w:t>
+      </w:r>
+      <w:r>
+        <w:rPr>
+          <w:rStyle w:val="VerbatimChar"/>
+        </w:rPr>
+        <w:t xml:space="preserve">tool</w:t>
+      </w:r>
+      <w:r>
+        <w:t xml:space="preserve"> </w:t>
+      </w:r>
+      <w:r>
+        <w:t xml:space="preserve">and orchestrators take</w:t>
+      </w:r>
+      <w:r>
+        <w:t xml:space="preserve"> </w:t>
+      </w:r>
+      <w:r>
+        <w:rPr>
+          <w:rStyle w:val="VerbatimChar"/>
+        </w:rPr>
+        <w:t xml:space="preserve">claude=/jira=/confluence=</w:t>
+      </w:r>
+      <w:r>
+        <w:t xml:space="preserve"> </w:t>
+      </w:r>
+      <w:r>
+        <w:t xml:space="preserve">— so the whole pipeline runs against fakes with zero network and zero API spend. The mocked suite is therefore a</w:t>
+      </w:r>
+      <w:r>
+        <w:t xml:space="preserve"> </w:t>
+      </w:r>
+      <w:r>
+        <w:rPr>
+          <w:i/>
+          <w:iCs/>
+        </w:rPr>
+        <w:t xml:space="preserve">faithful</w:t>
+      </w:r>
+      <w:r>
+        <w:t xml:space="preserve"> </w:t>
+      </w:r>
+      <w:r>
+        <w:t xml:space="preserve">test of the real code paths, not a toy.</w:t>
+      </w:r>
+    </w:p>
+    <w:bookmarkStart w:id="188" w:name="the-validation-stack-seven-layers"/>
+    <w:p>
+      <w:pPr>
+        <w:pStyle w:val="Heading3"/>
+      </w:pPr>
+      <w:r>
+        <w:t xml:space="preserve">The validation stack (seven layers)</w:t>
+      </w:r>
+    </w:p>
+    <w:tbl>
+      <w:tblPr>
+        <w:tblStyle w:val="Table"/>
+        <w:tblW w:type="pct" w:w="5000"/>
+        <w:tblLayout w:type="fixed"/>
+        <w:tblLook w:firstRow="1" w:lastRow="0" w:firstColumn="0" w:lastColumn="0" w:noHBand="0" w:noVBand="0" w:val="0020"/>
+      </w:tblPr>
+      <w:tblGrid>
+        <w:gridCol w:w="2640"/>
+        <w:gridCol w:w="2640"/>
+        <w:gridCol w:w="2640"/>
+      </w:tblGrid>
+      <w:tr>
+        <w:trPr>
+          <w:tblHeader w:val="on"/>
+        </w:trPr>
+        <w:tc>
+          <w:tcPr/>
+          <w:p>
+            <w:pPr>
+              <w:pStyle w:val="Compact"/>
+            </w:pPr>
+            <w:r>
+              <w:t xml:space="preserve">Layer</w:t>
+            </w:r>
+          </w:p>
+        </w:tc>
+        <w:tc>
+          <w:tcPr/>
+          <w:p>
+            <w:pPr>
+              <w:pStyle w:val="Compact"/>
+            </w:pPr>
+            <w:r>
+              <w:t xml:space="preserve">What it is</w:t>
+            </w:r>
+          </w:p>
+        </w:tc>
+        <w:tc>
+          <w:tcPr/>
+          <w:p>
+            <w:pPr>
+              <w:pStyle w:val="Compact"/>
+            </w:pPr>
+            <w:r>
+              <w:t xml:space="preserve">What it catches</w:t>
+            </w:r>
+          </w:p>
+        </w:tc>
+      </w:tr>
+      <w:tr>
+        <w:tc>
+          <w:tcPr/>
+          <w:p>
+            <w:pPr>
+              <w:pStyle w:val="Compact"/>
+            </w:pPr>
+            <w:r>
+              <w:rPr>
+                <w:b/>
+                <w:bCs/>
+              </w:rPr>
+              <w:t xml:space="preserve">1. Static</w:t>
+            </w:r>
+          </w:p>
+        </w:tc>
+        <w:tc>
+          <w:tcPr/>
+          <w:p>
+            <w:pPr>
+              <w:pStyle w:val="Compact"/>
+            </w:pPr>
+            <w:r>
+              <w:rPr>
+                <w:rStyle w:val="VerbatimChar"/>
+              </w:rPr>
+              <w:t xml:space="preserve">python -m py_compile</w:t>
+            </w:r>
+            <w:r>
+              <w:t xml:space="preserve"> </w:t>
+            </w:r>
+            <w:r>
+              <w:t xml:space="preserve">on every module;</w:t>
+            </w:r>
+            <w:r>
+              <w:t xml:space="preserve"> </w:t>
+            </w:r>
+            <w:r>
+              <w:rPr>
+                <w:rStyle w:val="VerbatimChar"/>
+              </w:rPr>
+              <w:t xml:space="preserve">ruff</w:t>
+            </w:r>
+            <w:r>
+              <w:t xml:space="preserve"> </w:t>
+            </w:r>
+            <w:r>
+              <w:t xml:space="preserve">(pyflakes + E9) in CI</w:t>
+            </w:r>
+          </w:p>
+        </w:tc>
+        <w:tc>
+          <w:tcPr/>
+          <w:p>
+            <w:pPr>
+              <w:pStyle w:val="Compact"/>
+            </w:pPr>
+            <w:r>
+              <w:t xml:space="preserve">syntax errors, undefined names, broken imports</w:t>
+            </w:r>
+          </w:p>
+        </w:tc>
+      </w:tr>
+      <w:tr>
+        <w:tc>
+          <w:tcPr/>
+          <w:p>
+            <w:pPr>
+              <w:pStyle w:val="Compact"/>
+            </w:pPr>
+            <w:r>
+              <w:rPr>
+                <w:b/>
+                <w:bCs/>
+              </w:rPr>
+              <w:t xml:space="preserve">2. Unit tests</w:t>
+            </w:r>
+          </w:p>
+        </w:tc>
+        <w:tc>
+          <w:tcPr/>
+          <w:p>
+            <w:pPr>
+              <w:pStyle w:val="Compact"/>
+            </w:pPr>
+            <w:r>
+              <w:rPr>
+                <w:b/>
+                <w:bCs/>
+              </w:rPr>
+              <w:t xml:space="preserve">128 mocked tests</w:t>
+            </w:r>
+            <w:r>
+              <w:t xml:space="preserve"> </w:t>
+            </w:r>
+            <w:r>
+              <w:t xml:space="preserve">across 9 files (agents, orchestrator, tools, guardrails, redactor, live Jira/Confluence incl. write-back, vision, eval runner)</w:t>
+            </w:r>
+          </w:p>
+        </w:tc>
+        <w:tc>
+          <w:tcPr/>
+          <w:p>
+            <w:pPr>
+              <w:pStyle w:val="Compact"/>
+            </w:pPr>
+            <w:r>
+              <w:t xml:space="preserve">per-component contract regressions; runs in ~1s, offline, $0</w:t>
+            </w:r>
+          </w:p>
+        </w:tc>
+      </w:tr>
+      <w:tr>
+        <w:tc>
+          <w:tcPr/>
+          <w:p>
+            <w:pPr>
+              <w:pStyle w:val="Compact"/>
+            </w:pPr>
+            <w:r>
+              <w:rPr>
+                <w:b/>
+                <w:bCs/>
+              </w:rPr>
+              <w:t xml:space="preserve">3. Integration / end-to-end</w:t>
+            </w:r>
+          </w:p>
+        </w:tc>
+        <w:tc>
+          <w:tcPr/>
+          <w:p>
+            <w:pPr>
+              <w:pStyle w:val="Compact"/>
+            </w:pPr>
+            <w:r>
+              <w:t xml:space="preserve">real CLI + UI runs against the live API; targeted single-case re-runs</w:t>
+            </w:r>
+          </w:p>
+        </w:tc>
+        <w:tc>
+          <w:tcPr/>
+          <w:p>
+            <w:pPr>
+              <w:pStyle w:val="Compact"/>
+            </w:pPr>
+            <w:r>
+              <w:t xml:space="preserve">wiring bugs the mocks can’t see;</w:t>
+            </w:r>
+            <w:r>
+              <w:t xml:space="preserve"> </w:t>
+            </w:r>
+            <w:r>
+              <w:t xml:space="preserve">“does it actually run?”</w:t>
+            </w:r>
+          </w:p>
+        </w:tc>
+      </w:tr>
+      <w:tr>
+        <w:tc>
+          <w:tcPr/>
+          <w:p>
+            <w:pPr>
+              <w:pStyle w:val="Compact"/>
+            </w:pPr>
+            <w:r>
+              <w:rPr>
+                <w:b/>
+                <w:bCs/>
+              </w:rPr>
+              <w:t xml:space="preserve">4. Behavioural evaluation</w:t>
+            </w:r>
+          </w:p>
+        </w:tc>
+        <w:tc>
+          <w:tcPr/>
+          <w:p>
+            <w:pPr>
+              <w:pStyle w:val="Compact"/>
+            </w:pPr>
+            <w:r>
+              <w:t xml:space="preserve">10-case golden suite + deterministic metrics + LLM-as-judge + the single-prompt baseline</w:t>
+            </w:r>
+          </w:p>
+        </w:tc>
+        <w:tc>
+          <w:tcPr/>
+          <w:p>
+            <w:pPr>
+              <w:pStyle w:val="Compact"/>
+            </w:pPr>
+            <w:r>
+              <w:rPr>
+                <w:i/>
+                <w:iCs/>
+              </w:rPr>
+              <w:t xml:space="preserve">quality/behaviour</w:t>
+            </w:r>
+            <w:r>
+              <w:t xml:space="preserve"> </w:t>
+            </w:r>
+            <w:r>
+              <w:t xml:space="preserve">regressions a unit test would pass through (vague AC, missed conflicts, the case_07 zero-stories bug)</w:t>
+            </w:r>
+          </w:p>
+        </w:tc>
+      </w:tr>
+      <w:tr>
+        <w:tc>
+          <w:tcPr/>
+          <w:p>
+            <w:pPr>
+              <w:pStyle w:val="Compact"/>
+            </w:pPr>
+            <w:r>
+              <w:rPr>
+                <w:b/>
+                <w:bCs/>
+              </w:rPr>
+              <w:t xml:space="preserve">5. Runtime guardrails</w:t>
+            </w:r>
+          </w:p>
+        </w:tc>
+        <w:tc>
+          <w:tcPr/>
+          <w:p>
+            <w:pPr>
+              <w:pStyle w:val="Compact"/>
+            </w:pPr>
+            <w:r>
+              <w:t xml:space="preserve">six deterministic post-synthesis checks (</w:t>
+            </w:r>
+            <w:r>
+              <w:rPr>
+                <w:rStyle w:val="VerbatimChar"/>
+              </w:rPr>
+              <w:t xml:space="preserve">src/guardrails.py</w:t>
+            </w:r>
+            <w:r>
+              <w:t xml:space="preserve">)</w:t>
+            </w:r>
+          </w:p>
+        </w:tc>
+        <w:tc>
+          <w:tcPr/>
+          <w:p>
+            <w:pPr>
+              <w:pStyle w:val="Compact"/>
+            </w:pPr>
+            <w:r>
+              <w:t xml:space="preserve">hallucination patterns at run time — e.g. a story with no resolvable</w:t>
+            </w:r>
+            <w:r>
+              <w:t xml:space="preserve"> </w:t>
+            </w:r>
+            <w:r>
+              <w:rPr>
+                <w:rStyle w:val="VerbatimChar"/>
+              </w:rPr>
+              <w:t xml:space="preserve">source_topic_id</w:t>
+            </w:r>
+          </w:p>
+        </w:tc>
+      </w:tr>
+      <w:tr>
+        <w:tc>
+          <w:tcPr/>
+          <w:p>
+            <w:pPr>
+              <w:pStyle w:val="Compact"/>
+            </w:pPr>
+            <w:r>
+              <w:rPr>
+                <w:b/>
+                <w:bCs/>
+              </w:rPr>
+              <w:t xml:space="preserve">6. Human review +</w:t>
+            </w:r>
+            <w:r>
+              <w:rPr>
+                <w:b/>
+                <w:bCs/>
+              </w:rPr>
+              <w:t xml:space="preserve"> </w:t>
+            </w:r>
+            <w:r>
+              <w:rPr>
+                <w:b/>
+                <w:bCs/>
+              </w:rPr>
+              <w:t xml:space="preserve">“verify against reality”</w:t>
+            </w:r>
+          </w:p>
+        </w:tc>
+        <w:tc>
+          <w:tcPr/>
+          <w:p>
+            <w:pPr>
+              <w:pStyle w:val="Compact"/>
+            </w:pPr>
+            <w:r>
+              <w:t xml:space="preserve">every AI-drafted change read before commit; AI</w:t>
+            </w:r>
+            <w:r>
+              <w:t xml:space="preserve"> </w:t>
+            </w:r>
+            <w:r>
+              <w:rPr>
+                <w:i/>
+                <w:iCs/>
+              </w:rPr>
+              <w:t xml:space="preserve">claims</w:t>
+            </w:r>
+            <w:r>
+              <w:t xml:space="preserve"> </w:t>
+            </w:r>
+            <w:r>
+              <w:t xml:space="preserve">checked against the code, the served DOM, and committed data</w:t>
+            </w:r>
+          </w:p>
+        </w:tc>
+        <w:tc>
+          <w:tcPr/>
+          <w:p>
+            <w:pPr>
+              <w:pStyle w:val="Compact"/>
+            </w:pPr>
+            <w:r>
+              <w:t xml:space="preserve">over-confident or stale AI assertions (the most dangerous failure mode of AI coding)</w:t>
+            </w:r>
+          </w:p>
+        </w:tc>
+      </w:tr>
+      <w:tr>
+        <w:tc>
+          <w:tcPr/>
+          <w:p>
+            <w:pPr>
+              <w:pStyle w:val="Compact"/>
+            </w:pPr>
+            <w:r>
+              <w:rPr>
+                <w:b/>
+                <w:bCs/>
+              </w:rPr>
+              <w:t xml:space="preserve">7. Provenance / auditability</w:t>
+            </w:r>
+          </w:p>
+        </w:tc>
+        <w:tc>
+          <w:tcPr/>
+          <w:p>
+            <w:pPr>
+              <w:pStyle w:val="Compact"/>
+            </w:pPr>
+            <w:r>
+              <w:t xml:space="preserve">every story →</w:t>
+            </w:r>
+            <w:r>
+              <w:t xml:space="preserve"> </w:t>
+            </w:r>
+            <w:r>
+              <w:rPr>
+                <w:rStyle w:val="VerbatimChar"/>
+              </w:rPr>
+              <w:t xml:space="preserve">source_topic_id</w:t>
+            </w:r>
+            <w:r>
+              <w:t xml:space="preserve"> </w:t>
+            </w:r>
+            <w:r>
+              <w:t xml:space="preserve">→ verbatim transcript quote; full prompt+response in the audit trail</w:t>
+            </w:r>
+          </w:p>
+        </w:tc>
+        <w:tc>
+          <w:tcPr/>
+          <w:p>
+            <w:pPr>
+              <w:pStyle w:val="Compact"/>
+            </w:pPr>
+            <w:r>
+              <w:t xml:space="preserve">lets a reviewer independently re-verify</w:t>
+            </w:r>
+            <w:r>
+              <w:t xml:space="preserve"> </w:t>
+            </w:r>
+            <w:r>
+              <w:rPr>
+                <w:i/>
+                <w:iCs/>
+              </w:rPr>
+              <w:t xml:space="preserve">any</w:t>
+            </w:r>
+            <w:r>
+              <w:t xml:space="preserve"> </w:t>
+            </w:r>
+            <w:r>
+              <w:t xml:space="preserve">individual output</w:t>
+            </w:r>
+          </w:p>
+        </w:tc>
+      </w:tr>
+    </w:tbl>
     <w:bookmarkEnd w:id="188"/>
+    <w:bookmarkStart w:id="189" w:name="X7a39388e6792c13171b8da2c142ef51e1bf96a6"/>
+    <w:p>
+      <w:pPr>
+        <w:pStyle w:val="Heading3"/>
+      </w:pPr>
+      <w:r>
+        <w:t xml:space="preserve">Why behavioural eval matters beyond unit tests</w:t>
+      </w:r>
+    </w:p>
+    <w:p>
+      <w:pPr>
+        <w:pStyle w:val="FirstParagraph"/>
+      </w:pPr>
+      <w:r>
+        <w:t xml:space="preserve">Unit tests use</w:t>
+      </w:r>
+      <w:r>
+        <w:t xml:space="preserve"> </w:t>
+      </w:r>
+      <w:r>
+        <w:rPr>
+          <w:b/>
+          <w:bCs/>
+        </w:rPr>
+        <w:t xml:space="preserve">canned</w:t>
+      </w:r>
+      <w:r>
+        <w:t xml:space="preserve"> </w:t>
+      </w:r>
+      <w:r>
+        <w:t xml:space="preserve">LLM responses, so they validate the deterministic plumbing but say nothing about whether the</w:t>
+      </w:r>
+      <w:r>
+        <w:t xml:space="preserve"> </w:t>
+      </w:r>
+      <w:r>
+        <w:rPr>
+          <w:i/>
+          <w:iCs/>
+        </w:rPr>
+        <w:t xml:space="preserve">prompts</w:t>
+      </w:r>
+      <w:r>
+        <w:t xml:space="preserve"> </w:t>
+      </w:r>
+      <w:r>
+        <w:t xml:space="preserve">produce good output. That gap is exactly where the golden eval earns its place. The clearest example: every unit test passed while</w:t>
+      </w:r>
+      <w:r>
+        <w:t xml:space="preserve"> </w:t>
+      </w:r>
+      <w:r>
+        <w:rPr>
+          <w:b/>
+          <w:bCs/>
+        </w:rPr>
+        <w:t xml:space="preserve">case_07 (conflict-heavy) silently produced zero stories</w:t>
+      </w:r>
+      <w:r>
+        <w:t xml:space="preserve"> </w:t>
+      </w:r>
+      <w:r>
+        <w:t xml:space="preserve">— only the eval’s 0.33 deterministic / 0.00 judge score exposed it. We root-caused it to the Parser (not the Story Writer, the obvious suspect), fixed the prompt, and</w:t>
+      </w:r>
+      <w:r>
+        <w:t xml:space="preserve"> </w:t>
+      </w:r>
+      <w:r>
+        <w:rPr>
+          <w:b/>
+          <w:bCs/>
+        </w:rPr>
+        <w:t xml:space="preserve">re-ran to confirm 1.00 / 0.90</w:t>
+      </w:r>
+      <w:r>
+        <w:t xml:space="preserve">. Unit tests can’t catch a prompt that’s</w:t>
+      </w:r>
+      <w:r>
+        <w:t xml:space="preserve"> </w:t>
+      </w:r>
+      <w:r>
+        <w:t xml:space="preserve">“syntactically fine but behaviourally wrong”</w:t>
+      </w:r>
+      <w:r>
+        <w:t xml:space="preserve">; the eval can.</w:t>
+      </w:r>
+    </w:p>
+    <w:bookmarkEnd w:id="189"/>
+    <w:bookmarkStart w:id="190" w:name="X1129d0f4f40ca75cba673aeaeadcd68fbac8599"/>
+    <w:p>
+      <w:pPr>
+        <w:pStyle w:val="Heading3"/>
+      </w:pPr>
+      <w:r>
+        <w:t xml:space="preserve">“Verify against reality, not assertions”</w:t>
+      </w:r>
+      <w:r>
+        <w:t xml:space="preserve"> </w:t>
+      </w:r>
+      <w:r>
+        <w:t xml:space="preserve">— real defects this caught</w:t>
+      </w:r>
+    </w:p>
+    <w:p>
+      <w:pPr>
+        <w:pStyle w:val="FirstParagraph"/>
+      </w:pPr>
+      <w:r>
+        <w:t xml:space="preserve">The highest-value validation was refusing to take AI (or prior docs) at their word. Concrete catches during this project:</w:t>
+      </w:r>
+    </w:p>
+    <w:p>
+      <w:pPr>
+        <w:pStyle w:val="Compact"/>
+        <w:numPr>
+          <w:ilvl w:val="0"/>
+          <w:numId w:val="1028"/>
+        </w:numPr>
+      </w:pPr>
+      <w:r>
+        <w:rPr>
+          <w:b/>
+          <w:bCs/>
+        </w:rPr>
+        <w:t xml:space="preserve">Vision silently ignored on Gemini.</w:t>
+      </w:r>
+      <w:r>
+        <w:t xml:space="preserve"> </w:t>
+      </w:r>
+      <w:r>
+        <w:t xml:space="preserve">Rather than trust</w:t>
+      </w:r>
+      <w:r>
+        <w:t xml:space="preserve"> </w:t>
+      </w:r>
+      <w:r>
+        <w:t xml:space="preserve">“vision works,”</w:t>
+      </w:r>
+      <w:r>
+        <w:t xml:space="preserve"> </w:t>
+      </w:r>
+      <w:r>
+        <w:t xml:space="preserve">we read</w:t>
+      </w:r>
+      <w:r>
+        <w:t xml:space="preserve"> </w:t>
+      </w:r>
+      <w:r>
+        <w:rPr>
+          <w:rStyle w:val="VerbatimChar"/>
+        </w:rPr>
+        <w:t xml:space="preserve">GeminiTool.call_for_json</w:t>
+      </w:r>
+      <w:r>
+        <w:t xml:space="preserve">’s signature — it has no</w:t>
+      </w:r>
+      <w:r>
+        <w:t xml:space="preserve"> </w:t>
+      </w:r>
+      <w:r>
+        <w:rPr>
+          <w:rStyle w:val="VerbatimChar"/>
+        </w:rPr>
+        <w:t xml:space="preserve">images</w:t>
+      </w:r>
+      <w:r>
+        <w:t xml:space="preserve"> </w:t>
+      </w:r>
+      <w:r>
+        <w:t xml:space="preserve">param, so the Parser was dropping the image on the Free/Balanced presets. Fixed with the vision auto-switch.</w:t>
+      </w:r>
+    </w:p>
+    <w:p>
+      <w:pPr>
+        <w:pStyle w:val="Compact"/>
+        <w:numPr>
+          <w:ilvl w:val="0"/>
+          <w:numId w:val="1028"/>
+        </w:numPr>
+      </w:pPr>
+      <w:r>
+        <w:rPr>
+          <w:rStyle w:val="VerbatimChar"/>
+          <w:b/>
+          <w:bCs/>
+        </w:rPr>
+        <w:t xml:space="preserve">v1_baseline</w:t>
+      </w:r>
+      <w:r>
+        <w:rPr>
+          <w:b/>
+          <w:bCs/>
+        </w:rPr>
+        <w:t xml:space="preserve"> </w:t>
+      </w:r>
+      <w:r>
+        <w:rPr>
+          <w:b/>
+          <w:bCs/>
+        </w:rPr>
+        <w:t xml:space="preserve">mislabeled.</w:t>
+      </w:r>
+      <w:r>
+        <w:t xml:space="preserve"> </w:t>
+      </w:r>
+      <w:r>
+        <w:t xml:space="preserve">The docs called it a</w:t>
+      </w:r>
+      <w:r>
+        <w:t xml:space="preserve"> </w:t>
+      </w:r>
+      <w:r>
+        <w:t xml:space="preserve">“single-agent baseline”</w:t>
+      </w:r>
+      <w:r>
+        <w:t xml:space="preserve">; inspecting</w:t>
+      </w:r>
+      <w:r>
+        <w:t xml:space="preserve"> </w:t>
+      </w:r>
+      <w:r>
+        <w:rPr>
+          <w:rStyle w:val="VerbatimChar"/>
+        </w:rPr>
+        <w:t xml:space="preserve">versions/v1_baseline/src/agents/</w:t>
+      </w:r>
+      <w:r>
+        <w:t xml:space="preserve"> </w:t>
+      </w:r>
+      <w:r>
+        <w:t xml:space="preserve">showed five agents + memory + audit. We corrected the docs and built a</w:t>
+      </w:r>
+      <w:r>
+        <w:t xml:space="preserve"> </w:t>
+      </w:r>
+      <w:r>
+        <w:rPr>
+          <w:i/>
+          <w:iCs/>
+        </w:rPr>
+        <w:t xml:space="preserve">genuine</w:t>
+      </w:r>
+      <w:r>
+        <w:t xml:space="preserve"> </w:t>
+      </w:r>
+      <w:r>
+        <w:t xml:space="preserve">single-prompt baseline to make the comparison honest.</w:t>
+      </w:r>
+    </w:p>
+    <w:p>
+      <w:pPr>
+        <w:pStyle w:val="Compact"/>
+        <w:numPr>
+          <w:ilvl w:val="0"/>
+          <w:numId w:val="1028"/>
+        </w:numPr>
+      </w:pPr>
+      <w:r>
+        <w:rPr>
+          <w:b/>
+          <w:bCs/>
+        </w:rPr>
+        <w:t xml:space="preserve">“Premium still hit a Gemini limit.”</w:t>
+      </w:r>
+      <w:r>
+        <w:t xml:space="preserve"> </w:t>
+      </w:r>
+      <w:r>
+        <w:t xml:space="preserve">Traced — not assumed — to compare-mode’s</w:t>
+      </w:r>
+      <w:r>
+        <w:t xml:space="preserve"> </w:t>
+      </w:r>
+      <w:r>
+        <w:rPr>
+          <w:i/>
+          <w:iCs/>
+        </w:rPr>
+        <w:t xml:space="preserve">secondary</w:t>
+      </w:r>
+      <w:r>
+        <w:t xml:space="preserve"> </w:t>
+      </w:r>
+      <w:r>
+        <w:t xml:space="preserve">leg defaulting to the all-Gemini Free preset; the presets themselves were correct.</w:t>
+      </w:r>
+    </w:p>
+    <w:p>
+      <w:pPr>
+        <w:pStyle w:val="Compact"/>
+        <w:numPr>
+          <w:ilvl w:val="0"/>
+          <w:numId w:val="1028"/>
+        </w:numPr>
+      </w:pPr>
+      <w:r>
+        <w:rPr>
+          <w:b/>
+          <w:bCs/>
+        </w:rPr>
+        <w:t xml:space="preserve">Multi-file</w:t>
+      </w:r>
+      <w:r>
+        <w:rPr>
+          <w:b/>
+          <w:bCs/>
+        </w:rPr>
+        <w:t xml:space="preserve"> </w:t>
+      </w:r>
+      <w:r>
+        <w:rPr>
+          <w:b/>
+          <w:bCs/>
+        </w:rPr>
+        <w:t xml:space="preserve">“not working.”</w:t>
+      </w:r>
+      <w:r>
+        <w:t xml:space="preserve"> </w:t>
+      </w:r>
+      <w:r>
+        <w:t xml:space="preserve">Verified the</w:t>
+      </w:r>
+      <w:r>
+        <w:t xml:space="preserve"> </w:t>
+      </w:r>
+      <w:r>
+        <w:rPr>
+          <w:i/>
+          <w:iCs/>
+        </w:rPr>
+        <w:t xml:space="preserve">served DOM</w:t>
+      </w:r>
+      <w:r>
+        <w:t xml:space="preserve"> </w:t>
+      </w:r>
+      <w:r>
+        <w:t xml:space="preserve">(</w:t>
+      </w:r>
+      <w:r>
+        <w:rPr>
+          <w:rStyle w:val="VerbatimChar"/>
+        </w:rPr>
+        <w:t xml:space="preserve">input[type=file]</w:t>
+      </w:r>
+      <w:r>
+        <w:t xml:space="preserve"> </w:t>
+      </w:r>
+      <w:r>
+        <w:t xml:space="preserve">had</w:t>
+      </w:r>
+      <w:r>
+        <w:t xml:space="preserve"> </w:t>
+      </w:r>
+      <w:r>
+        <w:rPr>
+          <w:rStyle w:val="VerbatimChar"/>
+        </w:rPr>
+        <w:t xml:space="preserve">multiple=true</w:t>
+      </w:r>
+      <w:r>
+        <w:t xml:space="preserve">) → diagnosed a stale browser tab, not a code bug.</w:t>
+      </w:r>
+    </w:p>
+    <w:p>
+      <w:pPr>
+        <w:pStyle w:val="Compact"/>
+        <w:numPr>
+          <w:ilvl w:val="0"/>
+          <w:numId w:val="1028"/>
+        </w:numPr>
+      </w:pPr>
+      <w:r>
+        <w:rPr>
+          <w:b/>
+          <w:bCs/>
+        </w:rPr>
+        <w:t xml:space="preserve">Prompt V2 broke the mocked tests</w:t>
+      </w:r>
+      <w:r>
+        <w:t xml:space="preserve"> </w:t>
+      </w:r>
+      <w:r>
+        <w:t xml:space="preserve">(the fakes match on prompt substrings) — caught immediately by running the suite, fixed by re-anchoring the fixtures.</w:t>
+      </w:r>
+    </w:p>
+    <w:p>
+      <w:pPr>
+        <w:pStyle w:val="Compact"/>
+        <w:numPr>
+          <w:ilvl w:val="0"/>
+          <w:numId w:val="1028"/>
+        </w:numPr>
+      </w:pPr>
+      <w:r>
+        <w:rPr>
+          <w:b/>
+          <w:bCs/>
+        </w:rPr>
+        <w:t xml:space="preserve">Doc-currency audit</w:t>
+      </w:r>
+      <w:r>
+        <w:t xml:space="preserve"> </w:t>
+      </w:r>
+      <w:r>
+        <w:t xml:space="preserve">caught a stale test count (</w:t>
+      </w:r>
+      <w:r>
+        <w:rPr>
+          <w:rStyle w:val="VerbatimChar"/>
+        </w:rPr>
+        <w:t xml:space="preserve">122 → 128</w:t>
+      </w:r>
+      <w:r>
+        <w:t xml:space="preserve">) and a now-false</w:t>
+      </w:r>
+      <w:r>
+        <w:t xml:space="preserve"> </w:t>
+      </w:r>
+      <w:r>
+        <w:t xml:space="preserve">“not write-back-as-tickets”</w:t>
+      </w:r>
+      <w:r>
+        <w:t xml:space="preserve"> </w:t>
+      </w:r>
+      <w:r>
+        <w:t xml:space="preserve">claim.</w:t>
+      </w:r>
+    </w:p>
+    <w:p>
+      <w:pPr>
+        <w:pStyle w:val="Compact"/>
+        <w:numPr>
+          <w:ilvl w:val="0"/>
+          <w:numId w:val="1028"/>
+        </w:numPr>
+      </w:pPr>
+      <w:r>
+        <w:rPr>
+          <w:b/>
+          <w:bCs/>
+        </w:rPr>
+        <w:t xml:space="preserve">Committed-data cross-check</w:t>
+      </w:r>
+      <w:r>
+        <w:t xml:space="preserve"> </w:t>
+      </w:r>
+      <w:r>
+        <w:t xml:space="preserve">— eval numbers in the docs are verified to match the committed</w:t>
+      </w:r>
+      <w:r>
+        <w:t xml:space="preserve"> </w:t>
+      </w:r>
+      <w:r>
+        <w:rPr>
+          <w:rStyle w:val="VerbatimChar"/>
+        </w:rPr>
+        <w:t xml:space="preserve">summary.json</w:t>
+      </w:r>
+      <w:r>
+        <w:t xml:space="preserve"> </w:t>
+      </w:r>
+      <w:r>
+        <w:t xml:space="preserve">(0.88 / 0.72), not just pasted.</w:t>
+      </w:r>
+    </w:p>
+    <w:bookmarkEnd w:id="190"/>
+    <w:bookmarkStart w:id="191" w:name="what-this-does-and-doesnt-guarantee"/>
+    <w:p>
+      <w:pPr>
+        <w:pStyle w:val="Heading3"/>
+      </w:pPr>
+      <w:r>
+        <w:t xml:space="preserve">What this does — and doesn’t — guarantee</w:t>
+      </w:r>
+    </w:p>
+    <w:p>
+      <w:pPr>
+        <w:pStyle w:val="FirstParagraph"/>
+      </w:pPr>
+      <w:r>
+        <w:t xml:space="preserve">The deterministic layers are</w:t>
+      </w:r>
+      <w:r>
+        <w:t xml:space="preserve"> </w:t>
+      </w:r>
+      <w:r>
+        <w:rPr>
+          <w:i/>
+          <w:iCs/>
+        </w:rPr>
+        <w:t xml:space="preserve">proven</w:t>
+      </w:r>
+      <w:r>
+        <w:t xml:space="preserve"> </w:t>
+      </w:r>
+      <w:r>
+        <w:t xml:space="preserve">by tests; the only non-determinism is the LLM’s wording, which is</w:t>
+      </w:r>
+      <w:r>
+        <w:t xml:space="preserve"> </w:t>
+      </w:r>
+      <w:r>
+        <w:rPr>
+          <w:b/>
+          <w:bCs/>
+        </w:rPr>
+        <w:t xml:space="preserve">bounded</w:t>
+      </w:r>
+      <w:r>
+        <w:t xml:space="preserve"> </w:t>
+      </w:r>
+      <w:r>
+        <w:t xml:space="preserve">by the strict per-prompt JSON schema, the</w:t>
+      </w:r>
+      <w:r>
+        <w:t xml:space="preserve"> </w:t>
+      </w:r>
+      <w:r>
+        <w:rPr>
+          <w:rStyle w:val="VerbatimChar"/>
+        </w:rPr>
+        <w:t xml:space="preserve">_extract_json_block</w:t>
+      </w:r>
+      <w:r>
+        <w:t xml:space="preserve"> </w:t>
+      </w:r>
+      <w:r>
+        <w:t xml:space="preserve">parser (malformed JSON →</w:t>
+      </w:r>
+      <w:r>
+        <w:t xml:space="preserve"> </w:t>
+      </w:r>
+      <w:r>
+        <w:rPr>
+          <w:rStyle w:val="VerbatimChar"/>
+        </w:rPr>
+        <w:t xml:space="preserve">ToolError</w:t>
+      </w:r>
+      <w:r>
+        <w:t xml:space="preserve">, surfaced, not silently mis-parsed), and the runtime guardrails. What remains is residual hallucination risk on an adversarial input — mitigated by the guardrails + the provenance chain, and ultimately by the product’s premise: the output is a</w:t>
+      </w:r>
+      <w:r>
+        <w:t xml:space="preserve"> </w:t>
+      </w:r>
+      <w:r>
+        <w:rPr>
+          <w:b/>
+          <w:bCs/>
+        </w:rPr>
+        <w:t xml:space="preserve">reviewable draft for a human</w:t>
+      </w:r>
+      <w:r>
+        <w:t xml:space="preserve">, not an auto-applied spec. That human-in-the-loop is the final validation layer, and it’s by design.</w:t>
+      </w:r>
+    </w:p>
+    <w:bookmarkEnd w:id="191"/>
+    <w:bookmarkEnd w:id="192"/>
+    <w:bookmarkEnd w:id="193"/>
     <w:sectPr>
       <w:footnotePr>
         <w:numRestart w:val="eachSect"/>
@@ -40258,6 +41462,39 @@
     <w:lvlOverride w:ilvl="8">
       <w:startOverride w:val="1"/>
     </w:lvlOverride>
+  </w:num>
+  <w:num w:numId="1027">
+    <w:abstractNumId w:val="99411"/>
+    <w:lvlOverride w:ilvl="0">
+      <w:startOverride w:val="1"/>
+    </w:lvlOverride>
+    <w:lvlOverride w:ilvl="1">
+      <w:startOverride w:val="1"/>
+    </w:lvlOverride>
+    <w:lvlOverride w:ilvl="2">
+      <w:startOverride w:val="1"/>
+    </w:lvlOverride>
+    <w:lvlOverride w:ilvl="3">
+      <w:startOverride w:val="1"/>
+    </w:lvlOverride>
+    <w:lvlOverride w:ilvl="4">
+      <w:startOverride w:val="1"/>
+    </w:lvlOverride>
+    <w:lvlOverride w:ilvl="5">
+      <w:startOverride w:val="1"/>
+    </w:lvlOverride>
+    <w:lvlOverride w:ilvl="6">
+      <w:startOverride w:val="1"/>
+    </w:lvlOverride>
+    <w:lvlOverride w:ilvl="7">
+      <w:startOverride w:val="1"/>
+    </w:lvlOverride>
+    <w:lvlOverride w:ilvl="8">
+      <w:startOverride w:val="1"/>
+    </w:lvlOverride>
+  </w:num>
+  <w:num w:numId="1028">
+    <w:abstractNumId w:val="991"/>
   </w:num>
 </w:numbering>
 </file>

</xml_diff>